<commit_message>
Add Instruction Memory Module
</commit_message>
<xml_diff>
--- a/SystemVerilog_8-bit_CPU__Description.docx
+++ b/SystemVerilog_8-bit_CPU__Description.docx
@@ -63,11 +63,19 @@
           <w:lang w:val="en-US"/>
         </w:rPr>
       </w:pPr>
-      <w:r>
-        <w:rPr>
-          <w:lang w:val="en-US"/>
-        </w:rPr>
-        <w:t>Musiaev Konstantin 2026</w:t>
+      <w:proofErr w:type="spellStart"/>
+      <w:r>
+        <w:rPr>
+          <w:lang w:val="en-US"/>
+        </w:rPr>
+        <w:t>Musiaev</w:t>
+      </w:r>
+      <w:proofErr w:type="spellEnd"/>
+      <w:r>
+        <w:rPr>
+          <w:lang w:val="en-US"/>
+        </w:rPr>
+        <w:t xml:space="preserve"> Konstantin 2026</w:t>
       </w:r>
     </w:p>
     <w:p>
@@ -1655,13 +1663,23 @@
         </w:rPr>
         <w:br/>
       </w:r>
-      <w:r>
-        <w:rPr>
-          <w:sz w:val="28"/>
-          <w:szCs w:val="28"/>
-          <w:lang w:val="en-US"/>
-        </w:rPr>
-        <w:t xml:space="preserve">ALU module is mathematical and logical controller implementing such commands. This part of CPU is built asynchronously (there is no </w:t>
+      <w:proofErr w:type="spellStart"/>
+      <w:r>
+        <w:rPr>
+          <w:sz w:val="28"/>
+          <w:szCs w:val="28"/>
+          <w:lang w:val="en-US"/>
+        </w:rPr>
+        <w:t>ALU</w:t>
+      </w:r>
+      <w:proofErr w:type="spellEnd"/>
+      <w:r>
+        <w:rPr>
+          <w:sz w:val="28"/>
+          <w:szCs w:val="28"/>
+          <w:lang w:val="en-US"/>
+        </w:rPr>
+        <w:t xml:space="preserve"> module is mathematical and logical controller implementing such commands. This part of CPU is built asynchronously (there is no </w:t>
       </w:r>
       <w:proofErr w:type="spellStart"/>
       <w:r>
@@ -2369,25 +2387,7 @@
           <w:szCs w:val="28"/>
           <w:lang w:val="en-US"/>
         </w:rPr>
-        <w:t xml:space="preserve"> is created for keeping flags (Zero, </w:t>
-      </w:r>
-      <w:proofErr w:type="gramStart"/>
-      <w:r>
-        <w:rPr>
-          <w:sz w:val="28"/>
-          <w:szCs w:val="28"/>
-          <w:lang w:val="en-US"/>
-        </w:rPr>
-        <w:t>Carry</w:t>
-      </w:r>
-      <w:proofErr w:type="gramEnd"/>
-      <w:r>
-        <w:rPr>
-          <w:sz w:val="28"/>
-          <w:szCs w:val="28"/>
-          <w:lang w:val="en-US"/>
-        </w:rPr>
-        <w:t xml:space="preserve"> bit, Sign, </w:t>
+        <w:t xml:space="preserve"> is created for keeping flags (Zero, Carry bit, Sign, </w:t>
       </w:r>
       <w:r>
         <w:rPr>
@@ -2405,6 +2405,7 @@
         <w:rPr>
           <w:sz w:val="28"/>
           <w:szCs w:val="28"/>
+          <w:lang w:val="en-US"/>
         </w:rPr>
       </w:pPr>
     </w:p>
@@ -2429,7 +2430,27 @@
           <w:szCs w:val="28"/>
           <w:lang w:val="en-US"/>
         </w:rPr>
-        <w:t>Memory Data</w:t>
+        <w:t>Data</w:t>
+      </w:r>
+      <w:r>
+        <w:rPr>
+          <w:b/>
+          <w:bCs/>
+          <w:sz w:val="28"/>
+          <w:szCs w:val="28"/>
+          <w:lang w:val="en-US"/>
+        </w:rPr>
+        <w:t xml:space="preserve"> </w:t>
+      </w:r>
+      <w:r>
+        <w:rPr>
+          <w:b/>
+          <w:bCs/>
+          <w:sz w:val="28"/>
+          <w:szCs w:val="28"/>
+          <w:lang w:val="en-US"/>
+        </w:rPr>
+        <w:t>Memory</w:t>
       </w:r>
       <w:r>
         <w:rPr>
@@ -2494,33 +2515,57 @@
     </w:p>
     <w:p>
       <w:pPr>
-        <w:rPr>
-          <w:sz w:val="28"/>
-          <w:szCs w:val="28"/>
-          <w:lang w:val="en-US"/>
-        </w:rPr>
-      </w:pPr>
-    </w:p>
-    <w:p>
-      <w:pPr>
-        <w:rPr>
-          <w:sz w:val="28"/>
-          <w:szCs w:val="28"/>
-          <w:lang w:val="en-US"/>
-        </w:rPr>
-      </w:pPr>
-    </w:p>
-    <w:p>
-      <w:pPr>
-        <w:rPr>
-          <w:sz w:val="28"/>
-          <w:szCs w:val="28"/>
-          <w:lang w:val="en-US"/>
-        </w:rPr>
-      </w:pPr>
-    </w:p>
-    <w:p>
-      <w:pPr>
+        <w:pStyle w:val="ListParagraph"/>
+        <w:numPr>
+          <w:ilvl w:val="0"/>
+          <w:numId w:val="4"/>
+        </w:numPr>
+        <w:rPr>
+          <w:sz w:val="28"/>
+          <w:szCs w:val="28"/>
+          <w:lang w:val="en-US"/>
+        </w:rPr>
+      </w:pPr>
+      <w:r>
+        <w:rPr>
+          <w:b/>
+          <w:bCs/>
+          <w:sz w:val="28"/>
+          <w:szCs w:val="28"/>
+          <w:lang w:val="en-US"/>
+        </w:rPr>
+        <w:t xml:space="preserve">Instruction </w:t>
+      </w:r>
+      <w:r>
+        <w:rPr>
+          <w:b/>
+          <w:bCs/>
+          <w:sz w:val="28"/>
+          <w:szCs w:val="28"/>
+          <w:lang w:val="en-US"/>
+        </w:rPr>
+        <w:t>Memory</w:t>
+      </w:r>
+      <w:r>
+        <w:rPr>
+          <w:sz w:val="28"/>
+          <w:szCs w:val="28"/>
+          <w:lang w:val="en-US"/>
+        </w:rPr>
+        <w:br/>
+      </w:r>
+      <w:r>
+        <w:rPr>
+          <w:sz w:val="28"/>
+          <w:szCs w:val="28"/>
+          <w:lang w:val="en-US"/>
+        </w:rPr>
+        <w:t>This module is similar to the previous memory block, as it is responsible for storage. The main difference is that it holds program instructions instead of variables and constants. Instructions are read asynchronously during execution, and write functionality is omitted (instructions are pre-loaded prior to execution).</w:t>
+      </w:r>
+    </w:p>
+    <w:p>
+      <w:pPr>
+        <w:pStyle w:val="ListParagraph"/>
         <w:rPr>
           <w:sz w:val="28"/>
           <w:szCs w:val="28"/>
@@ -2664,7 +2709,6 @@
           <w:szCs w:val="40"/>
           <w:lang w:val="en-US"/>
         </w:rPr>
-        <w:lastRenderedPageBreak/>
         <w:t>Appendices</w:t>
       </w:r>
     </w:p>
@@ -2705,7 +2749,7 @@
           <w:noProof/>
         </w:rPr>
         <w:drawing>
-          <wp:inline distT="0" distB="0" distL="0" distR="0" wp14:anchorId="3EEFF4BD" wp14:editId="3DB3495D">
+          <wp:inline distT="0" distB="0" distL="0" distR="0" wp14:anchorId="3EEFF4BD" wp14:editId="55E827A9">
             <wp:extent cx="5940425" cy="1614170"/>
             <wp:effectExtent l="0" t="0" r="3175" b="5080"/>
             <wp:docPr id="3" name="Picture 3"/>
@@ -2770,25 +2814,7 @@
           <w:szCs w:val="28"/>
           <w:lang w:val="en-US"/>
         </w:rPr>
-        <w:t xml:space="preserve">SUCCESS ADD: Expected result </w:t>
-      </w:r>
-      <w:proofErr w:type="gramStart"/>
-      <w:r>
-        <w:rPr>
-          <w:sz w:val="28"/>
-          <w:szCs w:val="28"/>
-          <w:lang w:val="en-US"/>
-        </w:rPr>
-        <w:t>(  15</w:t>
-      </w:r>
-      <w:proofErr w:type="gramEnd"/>
-      <w:r>
-        <w:rPr>
-          <w:sz w:val="28"/>
-          <w:szCs w:val="28"/>
-          <w:lang w:val="en-US"/>
-        </w:rPr>
-        <w:t>) was received correctly</w:t>
+        <w:t>SUCCESS ADD: Expected result (  15) was received correctly</w:t>
       </w:r>
     </w:p>
     <w:p>
@@ -2807,25 +2833,7 @@
           <w:szCs w:val="28"/>
           <w:lang w:val="en-US"/>
         </w:rPr>
-        <w:t xml:space="preserve">SUCCESS SUB: Expected result </w:t>
-      </w:r>
-      <w:proofErr w:type="gramStart"/>
-      <w:r>
-        <w:rPr>
-          <w:sz w:val="28"/>
-          <w:szCs w:val="28"/>
-          <w:lang w:val="en-US"/>
-        </w:rPr>
-        <w:t>(  -</w:t>
-      </w:r>
-      <w:proofErr w:type="gramEnd"/>
-      <w:r>
-        <w:rPr>
-          <w:sz w:val="28"/>
-          <w:szCs w:val="28"/>
-          <w:lang w:val="en-US"/>
-        </w:rPr>
-        <w:t>7) was received correctly</w:t>
+        <w:t>SUCCESS SUB: Expected result (  -7) was received correctly</w:t>
       </w:r>
     </w:p>
     <w:p>
@@ -2844,25 +2852,7 @@
           <w:szCs w:val="28"/>
           <w:lang w:val="en-US"/>
         </w:rPr>
-        <w:t xml:space="preserve">SUCCESS ADC: Expected result </w:t>
-      </w:r>
-      <w:proofErr w:type="gramStart"/>
-      <w:r>
-        <w:rPr>
-          <w:sz w:val="28"/>
-          <w:szCs w:val="28"/>
-          <w:lang w:val="en-US"/>
-        </w:rPr>
-        <w:t>(  40</w:t>
-      </w:r>
-      <w:proofErr w:type="gramEnd"/>
-      <w:r>
-        <w:rPr>
-          <w:sz w:val="28"/>
-          <w:szCs w:val="28"/>
-          <w:lang w:val="en-US"/>
-        </w:rPr>
-        <w:t>) was received correctly</w:t>
+        <w:t>SUCCESS ADC: Expected result (  40) was received correctly</w:t>
       </w:r>
     </w:p>
     <w:p>
@@ -2881,25 +2871,7 @@
           <w:szCs w:val="28"/>
           <w:lang w:val="en-US"/>
         </w:rPr>
-        <w:t xml:space="preserve">SUCCESS SUC: Expected result </w:t>
-      </w:r>
-      <w:proofErr w:type="gramStart"/>
-      <w:r>
-        <w:rPr>
-          <w:sz w:val="28"/>
-          <w:szCs w:val="28"/>
-          <w:lang w:val="en-US"/>
-        </w:rPr>
-        <w:t>(  38</w:t>
-      </w:r>
-      <w:proofErr w:type="gramEnd"/>
-      <w:r>
-        <w:rPr>
-          <w:sz w:val="28"/>
-          <w:szCs w:val="28"/>
-          <w:lang w:val="en-US"/>
-        </w:rPr>
-        <w:t>) was received correctly</w:t>
+        <w:t>SUCCESS SUC: Expected result (  38) was received correctly</w:t>
       </w:r>
     </w:p>
     <w:p>
@@ -2918,25 +2890,7 @@
           <w:szCs w:val="28"/>
           <w:lang w:val="en-US"/>
         </w:rPr>
-        <w:t xml:space="preserve">SUCCESS AND: Expected result </w:t>
-      </w:r>
-      <w:proofErr w:type="gramStart"/>
-      <w:r>
-        <w:rPr>
-          <w:sz w:val="28"/>
-          <w:szCs w:val="28"/>
-          <w:lang w:val="en-US"/>
-        </w:rPr>
-        <w:t xml:space="preserve">(  </w:t>
-      </w:r>
-      <w:proofErr w:type="gramEnd"/>
-      <w:r>
-        <w:rPr>
-          <w:sz w:val="28"/>
-          <w:szCs w:val="28"/>
-          <w:lang w:val="en-US"/>
-        </w:rPr>
-        <w:t xml:space="preserve"> 0) was received correctly</w:t>
+        <w:t>SUCCESS AND: Expected result (   0) was received correctly</w:t>
       </w:r>
     </w:p>
     <w:p>
@@ -2955,25 +2909,7 @@
           <w:szCs w:val="28"/>
           <w:lang w:val="en-US"/>
         </w:rPr>
-        <w:t xml:space="preserve">SUCCESS OR: Expected result </w:t>
-      </w:r>
-      <w:proofErr w:type="gramStart"/>
-      <w:r>
-        <w:rPr>
-          <w:sz w:val="28"/>
-          <w:szCs w:val="28"/>
-          <w:lang w:val="en-US"/>
-        </w:rPr>
-        <w:t xml:space="preserve">(  </w:t>
-      </w:r>
-      <w:proofErr w:type="gramEnd"/>
-      <w:r>
-        <w:rPr>
-          <w:sz w:val="28"/>
-          <w:szCs w:val="28"/>
-          <w:lang w:val="en-US"/>
-        </w:rPr>
-        <w:t xml:space="preserve"> 1) was received correctly</w:t>
+        <w:t>SUCCESS OR: Expected result (   1) was received correctly</w:t>
       </w:r>
     </w:p>
     <w:p>
@@ -3011,25 +2947,7 @@
           <w:szCs w:val="28"/>
           <w:lang w:val="en-US"/>
         </w:rPr>
-        <w:t xml:space="preserve">SUCCESS &gt;&gt;&gt;: Expected result </w:t>
-      </w:r>
-      <w:proofErr w:type="gramStart"/>
-      <w:r>
-        <w:rPr>
-          <w:sz w:val="28"/>
-          <w:szCs w:val="28"/>
-          <w:lang w:val="en-US"/>
-        </w:rPr>
-        <w:t>(  32</w:t>
-      </w:r>
-      <w:proofErr w:type="gramEnd"/>
-      <w:r>
-        <w:rPr>
-          <w:sz w:val="28"/>
-          <w:szCs w:val="28"/>
-          <w:lang w:val="en-US"/>
-        </w:rPr>
-        <w:t>) was received correctly</w:t>
+        <w:t>SUCCESS &gt;&gt;&gt;: Expected result (  32) was received correctly</w:t>
       </w:r>
     </w:p>
     <w:p>
@@ -3048,25 +2966,7 @@
           <w:szCs w:val="28"/>
           <w:lang w:val="en-US"/>
         </w:rPr>
-        <w:t xml:space="preserve">SUCCESS &lt;&lt;&lt;: Expected result </w:t>
-      </w:r>
-      <w:proofErr w:type="gramStart"/>
-      <w:r>
-        <w:rPr>
-          <w:sz w:val="28"/>
-          <w:szCs w:val="28"/>
-          <w:lang w:val="en-US"/>
-        </w:rPr>
-        <w:t xml:space="preserve">(  </w:t>
-      </w:r>
-      <w:proofErr w:type="gramEnd"/>
-      <w:r>
-        <w:rPr>
-          <w:sz w:val="28"/>
-          <w:szCs w:val="28"/>
-          <w:lang w:val="en-US"/>
-        </w:rPr>
-        <w:t xml:space="preserve"> 8) was received correctly</w:t>
+        <w:t>SUCCESS &lt;&lt;&lt;: Expected result (   8) was received correctly</w:t>
       </w:r>
     </w:p>
     <w:p>
@@ -3085,25 +2985,7 @@
           <w:szCs w:val="28"/>
           <w:lang w:val="en-US"/>
         </w:rPr>
-        <w:t xml:space="preserve">SUCCESS NOT: Expected result </w:t>
-      </w:r>
-      <w:proofErr w:type="gramStart"/>
-      <w:r>
-        <w:rPr>
-          <w:sz w:val="28"/>
-          <w:szCs w:val="28"/>
-          <w:lang w:val="en-US"/>
-        </w:rPr>
-        <w:t>(  -</w:t>
-      </w:r>
-      <w:proofErr w:type="gramEnd"/>
-      <w:r>
-        <w:rPr>
-          <w:sz w:val="28"/>
-          <w:szCs w:val="28"/>
-          <w:lang w:val="en-US"/>
-        </w:rPr>
-        <w:t>1) was received correctly</w:t>
+        <w:t>SUCCESS NOT: Expected result (  -1) was received correctly</w:t>
       </w:r>
     </w:p>
     <w:p>
@@ -3197,27 +3079,7 @@
           <w:szCs w:val="28"/>
           <w:lang w:val="en-US"/>
         </w:rPr>
-        <w:t>Register</w:t>
-      </w:r>
-      <w:r>
-        <w:rPr>
-          <w:b/>
-          <w:bCs/>
-          <w:sz w:val="28"/>
-          <w:szCs w:val="28"/>
-          <w:lang w:val="en-US"/>
-        </w:rPr>
-        <w:t xml:space="preserve"> File</w:t>
-      </w:r>
-      <w:r>
-        <w:rPr>
-          <w:b/>
-          <w:bCs/>
-          <w:sz w:val="28"/>
-          <w:szCs w:val="28"/>
-          <w:lang w:val="en-US"/>
-        </w:rPr>
-        <w:t xml:space="preserve"> (Simulation picture &amp; Logs)</w:t>
+        <w:t>Register File (Simulation picture &amp; Logs)</w:t>
       </w:r>
     </w:p>
     <w:p>
@@ -3236,6 +3098,7 @@
         <w:rPr>
           <w:b/>
           <w:bCs/>
+          <w:noProof/>
           <w:sz w:val="28"/>
           <w:szCs w:val="28"/>
         </w:rPr>
@@ -3309,25 +3172,7 @@
           <w:szCs w:val="28"/>
           <w:lang w:val="en-US"/>
         </w:rPr>
-        <w:t xml:space="preserve">SUCCESS: </w:t>
-      </w:r>
-      <w:proofErr w:type="gramStart"/>
-      <w:r>
-        <w:rPr>
-          <w:sz w:val="28"/>
-          <w:szCs w:val="28"/>
-          <w:lang w:val="en-US"/>
-        </w:rPr>
-        <w:t>Number  -</w:t>
-      </w:r>
-      <w:proofErr w:type="gramEnd"/>
-      <w:r>
-        <w:rPr>
-          <w:sz w:val="28"/>
-          <w:szCs w:val="28"/>
-          <w:lang w:val="en-US"/>
-        </w:rPr>
-        <w:t>38 was written in register_1</w:t>
+        <w:t>SUCCESS: Number  -38 was written in register_1</w:t>
       </w:r>
     </w:p>
     <w:p>
@@ -3424,7 +3269,6 @@
           <w:szCs w:val="28"/>
           <w:lang w:val="en-US"/>
         </w:rPr>
-        <w:lastRenderedPageBreak/>
         <w:t>Flag Register</w:t>
       </w:r>
       <w:r>
@@ -3450,6 +3294,7 @@
       </w:pPr>
       <w:r>
         <w:rPr>
+          <w:noProof/>
           <w:sz w:val="28"/>
           <w:szCs w:val="28"/>
           <w:lang w:val="en-US"/>
@@ -3751,6 +3596,7 @@
         <w:rPr>
           <w:sz w:val="28"/>
           <w:szCs w:val="28"/>
+          <w:lang w:val="en-US"/>
         </w:rPr>
       </w:pPr>
     </w:p>
@@ -3774,17 +3620,7 @@
           <w:szCs w:val="28"/>
           <w:lang w:val="en-US"/>
         </w:rPr>
-        <w:t xml:space="preserve">Data Memory </w:t>
-      </w:r>
-      <w:r>
-        <w:rPr>
-          <w:b/>
-          <w:bCs/>
-          <w:sz w:val="28"/>
-          <w:szCs w:val="28"/>
-          <w:lang w:val="en-US"/>
-        </w:rPr>
-        <w:t>(Simulation picture &amp; Logs)</w:t>
+        <w:t>Data Memory (Simulation picture &amp; Logs)</w:t>
       </w:r>
     </w:p>
     <w:p>
@@ -3799,6 +3635,7 @@
       </w:pPr>
       <w:r>
         <w:rPr>
+          <w:noProof/>
           <w:sz w:val="28"/>
           <w:szCs w:val="28"/>
           <w:lang w:val="en-US"/>
@@ -3855,54 +3692,26 @@
           <w:szCs w:val="28"/>
           <w:lang w:val="en-US"/>
         </w:rPr>
-        <w:t xml:space="preserve">SUCCESS: Expected data </w:t>
-      </w:r>
-      <w:proofErr w:type="gramStart"/>
-      <w:r>
-        <w:rPr>
-          <w:sz w:val="28"/>
-          <w:szCs w:val="28"/>
-          <w:lang w:val="en-US"/>
-        </w:rPr>
-        <w:t>(  13</w:t>
-      </w:r>
-      <w:proofErr w:type="gramEnd"/>
-      <w:r>
-        <w:rPr>
-          <w:sz w:val="28"/>
-          <w:szCs w:val="28"/>
-          <w:lang w:val="en-US"/>
-        </w:rPr>
-        <w:t>) was written to the address cell   0</w:t>
-      </w:r>
-    </w:p>
-    <w:p>
-      <w:pPr>
-        <w:pStyle w:val="ListParagraph"/>
-        <w:rPr>
-          <w:sz w:val="28"/>
-          <w:szCs w:val="28"/>
-          <w:lang w:val="en-US"/>
-        </w:rPr>
-      </w:pPr>
-      <w:r>
-        <w:rPr>
-          <w:sz w:val="28"/>
-          <w:szCs w:val="28"/>
-          <w:lang w:val="en-US"/>
-        </w:rPr>
-        <w:t xml:space="preserve">SUCCESS: Expected data ( -64) was written to the address </w:t>
-      </w:r>
-      <w:proofErr w:type="gramStart"/>
-      <w:r>
-        <w:rPr>
-          <w:sz w:val="28"/>
-          <w:szCs w:val="28"/>
-          <w:lang w:val="en-US"/>
-        </w:rPr>
-        <w:t>cell  17</w:t>
-      </w:r>
-      <w:proofErr w:type="gramEnd"/>
+        <w:t>SUCCESS: Expected data (  13) was written to the address cell   0</w:t>
+      </w:r>
+    </w:p>
+    <w:p>
+      <w:pPr>
+        <w:pStyle w:val="ListParagraph"/>
+        <w:rPr>
+          <w:sz w:val="28"/>
+          <w:szCs w:val="28"/>
+          <w:lang w:val="en-US"/>
+        </w:rPr>
+      </w:pPr>
+      <w:r>
+        <w:rPr>
+          <w:sz w:val="28"/>
+          <w:szCs w:val="28"/>
+          <w:lang w:val="en-US"/>
+        </w:rPr>
+        <w:t>SUCCESS: Expected data ( -64) was written to the address cell  17</w:t>
+      </w:r>
     </w:p>
     <w:p>
       <w:pPr>
@@ -3962,25 +3771,194 @@
           <w:szCs w:val="28"/>
           <w:lang w:val="en-US"/>
         </w:rPr>
-        <w:t xml:space="preserve">SUCCESS: Address </w:t>
-      </w:r>
-      <w:proofErr w:type="gramStart"/>
-      <w:r>
-        <w:rPr>
-          <w:sz w:val="28"/>
-          <w:szCs w:val="28"/>
-          <w:lang w:val="en-US"/>
-        </w:rPr>
-        <w:t>cell  17</w:t>
-      </w:r>
-      <w:proofErr w:type="gramEnd"/>
-      <w:r>
-        <w:rPr>
-          <w:sz w:val="28"/>
-          <w:szCs w:val="28"/>
-          <w:lang w:val="en-US"/>
-        </w:rPr>
-        <w:t xml:space="preserve"> was reset to zero</w:t>
+        <w:t>SUCCESS: Address cell  17 was reset to zero</w:t>
+      </w:r>
+    </w:p>
+    <w:p>
+      <w:pPr>
+        <w:pStyle w:val="ListParagraph"/>
+        <w:ind w:left="0"/>
+        <w:rPr>
+          <w:b/>
+          <w:bCs/>
+          <w:sz w:val="28"/>
+          <w:szCs w:val="28"/>
+          <w:lang w:val="en-US"/>
+        </w:rPr>
+      </w:pPr>
+      <w:r>
+        <w:rPr>
+          <w:sz w:val="28"/>
+          <w:szCs w:val="28"/>
+          <w:lang w:val="en-US"/>
+        </w:rPr>
+        <w:br/>
+      </w:r>
+      <w:r>
+        <w:rPr>
+          <w:b/>
+          <w:bCs/>
+          <w:sz w:val="28"/>
+          <w:szCs w:val="28"/>
+          <w:lang w:val="en-US"/>
+        </w:rPr>
+        <w:t xml:space="preserve">Instruction </w:t>
+      </w:r>
+      <w:r>
+        <w:rPr>
+          <w:b/>
+          <w:bCs/>
+          <w:sz w:val="28"/>
+          <w:szCs w:val="28"/>
+          <w:lang w:val="en-US"/>
+        </w:rPr>
+        <w:t>Memory</w:t>
+      </w:r>
+      <w:r>
+        <w:rPr>
+          <w:b/>
+          <w:bCs/>
+          <w:sz w:val="28"/>
+          <w:szCs w:val="28"/>
+          <w:lang w:val="en-US"/>
+        </w:rPr>
+        <w:t xml:space="preserve"> </w:t>
+      </w:r>
+      <w:r>
+        <w:rPr>
+          <w:b/>
+          <w:bCs/>
+          <w:sz w:val="28"/>
+          <w:szCs w:val="28"/>
+          <w:lang w:val="en-US"/>
+        </w:rPr>
+        <w:t>(Simulation picture &amp; Logs)</w:t>
+      </w:r>
+      <w:r>
+        <w:rPr>
+          <w:b/>
+          <w:bCs/>
+          <w:sz w:val="28"/>
+          <w:szCs w:val="28"/>
+          <w:lang w:val="en-US"/>
+        </w:rPr>
+        <w:br/>
+      </w:r>
+      <w:r>
+        <w:rPr>
+          <w:noProof/>
+        </w:rPr>
+        <w:drawing>
+          <wp:inline distT="0" distB="0" distL="0" distR="0" wp14:anchorId="4A82074F" wp14:editId="1D620F0D">
+            <wp:extent cx="5940425" cy="840740"/>
+            <wp:effectExtent l="0" t="0" r="3175" b="0"/>
+            <wp:docPr id="7" name="Picture 7"/>
+            <wp:cNvGraphicFramePr>
+              <a:graphicFrameLocks xmlns:a="http://schemas.openxmlformats.org/drawingml/2006/main" noChangeAspect="1"/>
+            </wp:cNvGraphicFramePr>
+            <a:graphic xmlns:a="http://schemas.openxmlformats.org/drawingml/2006/main">
+              <a:graphicData uri="http://schemas.openxmlformats.org/drawingml/2006/picture">
+                <pic:pic xmlns:pic="http://schemas.openxmlformats.org/drawingml/2006/picture">
+                  <pic:nvPicPr>
+                    <pic:cNvPr id="0" name="Picture 6"/>
+                    <pic:cNvPicPr>
+                      <a:picLocks noChangeAspect="1" noChangeArrowheads="1"/>
+                    </pic:cNvPicPr>
+                  </pic:nvPicPr>
+                  <pic:blipFill>
+                    <a:blip r:embed="rId10" cstate="print">
+                      <a:extLst>
+                        <a:ext uri="{28A0092B-C50C-407E-A947-70E740481C1C}">
+                          <a14:useLocalDpi xmlns:a14="http://schemas.microsoft.com/office/drawing/2010/main" val="0"/>
+                        </a:ext>
+                      </a:extLst>
+                    </a:blip>
+                    <a:srcRect/>
+                    <a:stretch>
+                      <a:fillRect/>
+                    </a:stretch>
+                  </pic:blipFill>
+                  <pic:spPr bwMode="auto">
+                    <a:xfrm>
+                      <a:off x="0" y="0"/>
+                      <a:ext cx="5940425" cy="840740"/>
+                    </a:xfrm>
+                    <a:prstGeom prst="rect">
+                      <a:avLst/>
+                    </a:prstGeom>
+                    <a:noFill/>
+                    <a:ln>
+                      <a:noFill/>
+                    </a:ln>
+                  </pic:spPr>
+                </pic:pic>
+              </a:graphicData>
+            </a:graphic>
+          </wp:inline>
+        </w:drawing>
+      </w:r>
+    </w:p>
+    <w:p>
+      <w:pPr>
+        <w:pStyle w:val="ListParagraph"/>
+        <w:rPr>
+          <w:sz w:val="28"/>
+          <w:szCs w:val="28"/>
+          <w:lang w:val="en-US"/>
+        </w:rPr>
+      </w:pPr>
+      <w:r>
+        <w:rPr>
+          <w:sz w:val="28"/>
+          <w:szCs w:val="28"/>
+          <w:lang w:val="en-US"/>
+        </w:rPr>
+        <w:t>SUCCESS: Expected data ( 4660) is located in the address cell   0</w:t>
+      </w:r>
+    </w:p>
+    <w:p>
+      <w:pPr>
+        <w:pStyle w:val="ListParagraph"/>
+        <w:rPr>
+          <w:sz w:val="28"/>
+          <w:szCs w:val="28"/>
+          <w:lang w:val="en-US"/>
+        </w:rPr>
+      </w:pPr>
+      <w:r>
+        <w:rPr>
+          <w:sz w:val="28"/>
+          <w:szCs w:val="28"/>
+          <w:lang w:val="en-US"/>
+        </w:rPr>
+        <w:t>SUCCESS: Expected data (13092) is located in the address cell   1</w:t>
+      </w:r>
+    </w:p>
+    <w:p>
+      <w:pPr>
+        <w:pStyle w:val="ListParagraph"/>
+        <w:ind w:left="0"/>
+        <w:rPr>
+          <w:sz w:val="28"/>
+          <w:szCs w:val="28"/>
+          <w:lang w:val="en-US"/>
+        </w:rPr>
+      </w:pPr>
+      <w:r>
+        <w:rPr>
+          <w:sz w:val="28"/>
+          <w:szCs w:val="28"/>
+          <w:lang w:val="en-US"/>
+        </w:rPr>
+        <w:tab/>
+      </w:r>
+      <w:r>
+        <w:rPr>
+          <w:sz w:val="28"/>
+          <w:szCs w:val="28"/>
+          <w:lang w:val="en-US"/>
+        </w:rPr>
+        <w:t>SUCCESS: Expected data ( 8497) is located in the address cell   2</w:t>
       </w:r>
     </w:p>
     <w:sectPr>
@@ -5237,6 +5215,7 @@
   <w:style w:type="character" w:default="1" w:styleId="DefaultParagraphFont">
     <w:name w:val="Default Paragraph Font"/>
     <w:uiPriority w:val="1"/>
+    <w:semiHidden/>
     <w:unhideWhenUsed/>
   </w:style>
   <w:style w:type="table" w:default="1" w:styleId="TableNormal">

</xml_diff>

<commit_message>
Add Program Counter module
</commit_message>
<xml_diff>
--- a/SystemVerilog_8-bit_CPU__Description.docx
+++ b/SystemVerilog_8-bit_CPU__Description.docx
@@ -13,7 +13,6 @@
           <w:lang w:val="en-US"/>
         </w:rPr>
       </w:pPr>
-      <w:proofErr w:type="spellStart"/>
       <w:r>
         <w:rPr>
           <w:b/>
@@ -42,18 +41,7 @@
           <w:szCs w:val="40"/>
           <w:lang w:val="en-US"/>
         </w:rPr>
-        <w:t>temVerilog</w:t>
-      </w:r>
-      <w:proofErr w:type="spellEnd"/>
-      <w:r>
-        <w:rPr>
-          <w:b/>
-          <w:bCs/>
-          <w:sz w:val="40"/>
-          <w:szCs w:val="40"/>
-          <w:lang w:val="en-US"/>
-        </w:rPr>
-        <w:t xml:space="preserve"> 8-bit CPU</w:t>
+        <w:t>temVerilog 8-bit CPU</w:t>
       </w:r>
     </w:p>
     <w:p>
@@ -63,19 +51,11 @@
           <w:lang w:val="en-US"/>
         </w:rPr>
       </w:pPr>
-      <w:proofErr w:type="spellStart"/>
-      <w:r>
-        <w:rPr>
-          <w:lang w:val="en-US"/>
-        </w:rPr>
-        <w:t>Musiaev</w:t>
-      </w:r>
-      <w:proofErr w:type="spellEnd"/>
-      <w:r>
-        <w:rPr>
-          <w:lang w:val="en-US"/>
-        </w:rPr>
-        <w:t xml:space="preserve"> Konstantin 2026</w:t>
+      <w:r>
+        <w:rPr>
+          <w:lang w:val="en-US"/>
+        </w:rPr>
+        <w:t>Musiaev Konstantin 2026</w:t>
       </w:r>
     </w:p>
     <w:p>
@@ -258,29 +238,7 @@
           <w:szCs w:val="28"/>
           <w:lang w:val="en-US"/>
         </w:rPr>
-        <w:t>Hardware description (</w:t>
-      </w:r>
-      <w:proofErr w:type="spellStart"/>
-      <w:r>
-        <w:rPr>
-          <w:b/>
-          <w:bCs/>
-          <w:sz w:val="28"/>
-          <w:szCs w:val="28"/>
-          <w:lang w:val="en-US"/>
-        </w:rPr>
-        <w:t>SystemVerilog</w:t>
-      </w:r>
-      <w:proofErr w:type="spellEnd"/>
-      <w:r>
-        <w:rPr>
-          <w:b/>
-          <w:bCs/>
-          <w:sz w:val="28"/>
-          <w:szCs w:val="28"/>
-          <w:lang w:val="en-US"/>
-        </w:rPr>
-        <w:t xml:space="preserve"> &amp; Simulation)</w:t>
+        <w:t>Hardware description (SystemVerilog &amp; Simulation)</w:t>
       </w:r>
     </w:p>
     <w:p>
@@ -944,25 +902,7 @@
           <w:szCs w:val="28"/>
           <w:lang w:val="en-US"/>
         </w:rPr>
-        <w:t xml:space="preserve">The primary goal of this project is the design, </w:t>
-      </w:r>
-      <w:proofErr w:type="spellStart"/>
-      <w:r>
-        <w:rPr>
-          <w:sz w:val="28"/>
-          <w:szCs w:val="28"/>
-          <w:lang w:val="en-US"/>
-        </w:rPr>
-        <w:t>SystemVerilog</w:t>
-      </w:r>
-      <w:proofErr w:type="spellEnd"/>
-      <w:r>
-        <w:rPr>
-          <w:sz w:val="28"/>
-          <w:szCs w:val="28"/>
-          <w:lang w:val="en-US"/>
-        </w:rPr>
-        <w:t xml:space="preserve"> implementation, and functional verification of an 8-bit Central Processing Unit (CPU). Following the hardware realization, a custom software ecosystem</w:t>
+        <w:t>The primary goal of this project is the design, SystemVerilog implementation, and functional verification of an 8-bit Central Processing Unit (CPU). Following the hardware realization, a custom software ecosystem</w:t>
       </w:r>
       <w:r>
         <w:rPr>
@@ -1523,29 +1463,7 @@
           <w:lang w:val="en-US"/>
         </w:rPr>
         <w:lastRenderedPageBreak/>
-        <w:t>Hardware description (</w:t>
-      </w:r>
-      <w:proofErr w:type="spellStart"/>
-      <w:r>
-        <w:rPr>
-          <w:b/>
-          <w:bCs/>
-          <w:sz w:val="40"/>
-          <w:szCs w:val="40"/>
-          <w:lang w:val="en-US"/>
-        </w:rPr>
-        <w:t>SystemVerilog</w:t>
-      </w:r>
-      <w:proofErr w:type="spellEnd"/>
-      <w:r>
-        <w:rPr>
-          <w:b/>
-          <w:bCs/>
-          <w:sz w:val="40"/>
-          <w:szCs w:val="40"/>
-          <w:lang w:val="en-US"/>
-        </w:rPr>
-        <w:t xml:space="preserve"> &amp; Simulation)</w:t>
+        <w:t>Hardware description (SystemVerilog &amp; Simulation)</w:t>
       </w:r>
     </w:p>
     <w:p>
@@ -1663,41 +1581,13 @@
         </w:rPr>
         <w:br/>
       </w:r>
-      <w:proofErr w:type="spellStart"/>
-      <w:r>
-        <w:rPr>
-          <w:sz w:val="28"/>
-          <w:szCs w:val="28"/>
-          <w:lang w:val="en-US"/>
-        </w:rPr>
-        <w:t>ALU</w:t>
-      </w:r>
-      <w:proofErr w:type="spellEnd"/>
-      <w:r>
-        <w:rPr>
-          <w:sz w:val="28"/>
-          <w:szCs w:val="28"/>
-          <w:lang w:val="en-US"/>
-        </w:rPr>
-        <w:t xml:space="preserve"> module is mathematical and logical controller implementing such commands. This part of CPU is built asynchronously (there is no </w:t>
-      </w:r>
-      <w:proofErr w:type="spellStart"/>
-      <w:r>
-        <w:rPr>
-          <w:sz w:val="28"/>
-          <w:szCs w:val="28"/>
-          <w:lang w:val="en-US"/>
-        </w:rPr>
-        <w:t>clk</w:t>
-      </w:r>
-      <w:proofErr w:type="spellEnd"/>
-      <w:r>
-        <w:rPr>
-          <w:sz w:val="28"/>
-          <w:szCs w:val="28"/>
-          <w:lang w:val="en-US"/>
-        </w:rPr>
-        <w:t xml:space="preserve"> / reset </w:t>
+      <w:r>
+        <w:rPr>
+          <w:sz w:val="28"/>
+          <w:szCs w:val="28"/>
+          <w:lang w:val="en-US"/>
+        </w:rPr>
+        <w:t xml:space="preserve">ALU module is mathematical and logical controller implementing such commands. This part of CPU is built asynchronously (there is no clk / reset </w:t>
       </w:r>
       <w:r>
         <w:rPr>
@@ -2265,34 +2155,7 @@
           <w:szCs w:val="28"/>
           <w:lang w:val="en-US"/>
         </w:rPr>
-        <w:t xml:space="preserve">. Read / Write commands are realized in 2 different ways. Reading is executed asynchronously using “assign” operator allows get located data immediately, whereas writing depends on </w:t>
-      </w:r>
-      <w:proofErr w:type="spellStart"/>
-      <w:r>
-        <w:rPr>
-          <w:sz w:val="28"/>
-          <w:szCs w:val="28"/>
-          <w:lang w:val="en-US"/>
-        </w:rPr>
-        <w:t>clk</w:t>
-      </w:r>
-      <w:proofErr w:type="spellEnd"/>
-      <w:r>
-        <w:rPr>
-          <w:sz w:val="28"/>
-          <w:szCs w:val="28"/>
-          <w:lang w:val="en-US"/>
-        </w:rPr>
-        <w:t xml:space="preserve"> signal to avoid </w:t>
-      </w:r>
-      <w:proofErr w:type="spellStart"/>
-      <w:r>
-        <w:rPr>
-          <w:sz w:val="28"/>
-          <w:szCs w:val="28"/>
-          <w:lang w:val="en-US"/>
-        </w:rPr>
-        <w:t>ra</w:t>
+        <w:t>. Read / Write commands are realized in 2 different ways. Reading is executed asynchronously using “assign” operator allows get located data immediately, whereas writing depends on clk signal to avoid ra</w:t>
       </w:r>
       <w:r>
         <w:rPr>
@@ -2301,7 +2164,6 @@
         </w:rPr>
         <w:t>сы</w:t>
       </w:r>
-      <w:proofErr w:type="spellEnd"/>
       <w:r>
         <w:rPr>
           <w:sz w:val="28"/>
@@ -2566,39 +2428,39 @@
     <w:p>
       <w:pPr>
         <w:pStyle w:val="ListParagraph"/>
-        <w:rPr>
-          <w:sz w:val="28"/>
-          <w:szCs w:val="28"/>
-          <w:lang w:val="en-US"/>
-        </w:rPr>
-      </w:pPr>
-    </w:p>
-    <w:p>
-      <w:pPr>
-        <w:rPr>
-          <w:sz w:val="28"/>
-          <w:szCs w:val="28"/>
-          <w:lang w:val="en-US"/>
-        </w:rPr>
-      </w:pPr>
-    </w:p>
-    <w:p>
-      <w:pPr>
-        <w:rPr>
-          <w:sz w:val="28"/>
-          <w:szCs w:val="28"/>
-          <w:lang w:val="en-US"/>
-        </w:rPr>
-      </w:pPr>
-    </w:p>
-    <w:p>
-      <w:pPr>
-        <w:rPr>
-          <w:sz w:val="28"/>
-          <w:szCs w:val="28"/>
-          <w:lang w:val="en-US"/>
-        </w:rPr>
-      </w:pPr>
+        <w:ind w:left="990"/>
+        <w:rPr>
+          <w:sz w:val="28"/>
+          <w:szCs w:val="28"/>
+          <w:lang w:val="en-US"/>
+        </w:rPr>
+      </w:pPr>
+    </w:p>
+    <w:p>
+      <w:pPr>
+        <w:pStyle w:val="ListParagraph"/>
+        <w:numPr>
+          <w:ilvl w:val="0"/>
+          <w:numId w:val="4"/>
+        </w:numPr>
+        <w:rPr>
+          <w:b/>
+          <w:bCs/>
+          <w:sz w:val="28"/>
+          <w:szCs w:val="28"/>
+          <w:lang w:val="en-US"/>
+        </w:rPr>
+      </w:pPr>
+      <w:r>
+        <w:rPr>
+          <w:b/>
+          <w:bCs/>
+          <w:sz w:val="28"/>
+          <w:szCs w:val="28"/>
+          <w:lang w:val="en-US"/>
+        </w:rPr>
+        <w:t>Program Counter</w:t>
+      </w:r>
     </w:p>
     <w:p>
       <w:pPr>
@@ -2731,6 +2593,7 @@
           <w:szCs w:val="28"/>
           <w:lang w:val="en-US"/>
         </w:rPr>
+        <w:lastRenderedPageBreak/>
         <w:t>ALU (Simulation picture &amp; Logs)</w:t>
       </w:r>
       <w:bookmarkEnd w:id="0"/>
@@ -2749,7 +2612,7 @@
           <w:noProof/>
         </w:rPr>
         <w:drawing>
-          <wp:inline distT="0" distB="0" distL="0" distR="0" wp14:anchorId="3EEFF4BD" wp14:editId="55E827A9">
+          <wp:inline distT="0" distB="0" distL="0" distR="0" wp14:anchorId="3EEFF4BD" wp14:editId="120CA161">
             <wp:extent cx="5940425" cy="1614170"/>
             <wp:effectExtent l="0" t="0" r="3175" b="5080"/>
             <wp:docPr id="3" name="Picture 3"/>
@@ -3299,6 +3162,7 @@
           <w:szCs w:val="28"/>
           <w:lang w:val="en-US"/>
         </w:rPr>
+        <w:lastRenderedPageBreak/>
         <w:drawing>
           <wp:inline distT="0" distB="0" distL="0" distR="0" wp14:anchorId="63CCA24F" wp14:editId="38135F44">
             <wp:extent cx="5940425" cy="1023620"/>
@@ -3385,25 +3249,7 @@
           <w:szCs w:val="28"/>
           <w:lang w:val="en-US"/>
         </w:rPr>
-        <w:t xml:space="preserve">SUCCESS: </w:t>
-      </w:r>
-      <w:proofErr w:type="spellStart"/>
-      <w:r>
-        <w:rPr>
-          <w:sz w:val="28"/>
-          <w:szCs w:val="28"/>
-          <w:lang w:val="en-US"/>
-        </w:rPr>
-        <w:t>carry_out</w:t>
-      </w:r>
-      <w:proofErr w:type="spellEnd"/>
-      <w:r>
-        <w:rPr>
-          <w:sz w:val="28"/>
-          <w:szCs w:val="28"/>
-          <w:lang w:val="en-US"/>
-        </w:rPr>
-        <w:t xml:space="preserve"> flag was set correctly (1)</w:t>
+        <w:t>SUCCESS: carry_out flag was set correctly (1)</w:t>
       </w:r>
     </w:p>
     <w:p>
@@ -3507,25 +3353,7 @@
           <w:szCs w:val="28"/>
           <w:lang w:val="en-US"/>
         </w:rPr>
-        <w:t xml:space="preserve">SUCCESS: </w:t>
-      </w:r>
-      <w:proofErr w:type="spellStart"/>
-      <w:r>
-        <w:rPr>
-          <w:sz w:val="28"/>
-          <w:szCs w:val="28"/>
-          <w:lang w:val="en-US"/>
-        </w:rPr>
-        <w:t>carry_out</w:t>
-      </w:r>
-      <w:proofErr w:type="spellEnd"/>
-      <w:r>
-        <w:rPr>
-          <w:sz w:val="28"/>
-          <w:szCs w:val="28"/>
-          <w:lang w:val="en-US"/>
-        </w:rPr>
-        <w:t xml:space="preserve"> flag was set correctly (0)</w:t>
+        <w:t>SUCCESS: carry_out flag was set correctly (0)</w:t>
       </w:r>
     </w:p>
     <w:p>
@@ -3849,7 +3677,7 @@
           <w:noProof/>
         </w:rPr>
         <w:drawing>
-          <wp:inline distT="0" distB="0" distL="0" distR="0" wp14:anchorId="4A82074F" wp14:editId="1D620F0D">
+          <wp:inline distT="0" distB="0" distL="0" distR="0" wp14:anchorId="4A82074F" wp14:editId="4AD2BF95">
             <wp:extent cx="5940425" cy="840740"/>
             <wp:effectExtent l="0" t="0" r="3175" b="0"/>
             <wp:docPr id="7" name="Picture 7"/>
@@ -3959,6 +3787,223 @@
           <w:lang w:val="en-US"/>
         </w:rPr>
         <w:t>SUCCESS: Expected data ( 8497) is located in the address cell   2</w:t>
+      </w:r>
+    </w:p>
+    <w:p>
+      <w:pPr>
+        <w:pStyle w:val="ListParagraph"/>
+        <w:ind w:left="0"/>
+        <w:rPr>
+          <w:sz w:val="28"/>
+          <w:szCs w:val="28"/>
+          <w:lang w:val="en-US"/>
+        </w:rPr>
+      </w:pPr>
+    </w:p>
+    <w:p>
+      <w:pPr>
+        <w:pStyle w:val="ListParagraph"/>
+        <w:ind w:left="0"/>
+        <w:rPr>
+          <w:sz w:val="28"/>
+          <w:szCs w:val="28"/>
+          <w:lang w:val="en-US"/>
+        </w:rPr>
+      </w:pPr>
+    </w:p>
+    <w:p>
+      <w:pPr>
+        <w:pStyle w:val="ListParagraph"/>
+        <w:ind w:left="0"/>
+        <w:rPr>
+          <w:sz w:val="28"/>
+          <w:szCs w:val="28"/>
+          <w:lang w:val="en-US"/>
+        </w:rPr>
+      </w:pPr>
+    </w:p>
+    <w:p>
+      <w:pPr>
+        <w:pStyle w:val="ListParagraph"/>
+        <w:ind w:left="0"/>
+        <w:rPr>
+          <w:sz w:val="28"/>
+          <w:szCs w:val="28"/>
+          <w:lang w:val="en-US"/>
+        </w:rPr>
+      </w:pPr>
+    </w:p>
+    <w:p>
+      <w:pPr>
+        <w:pStyle w:val="ListParagraph"/>
+        <w:ind w:left="0"/>
+        <w:rPr>
+          <w:sz w:val="28"/>
+          <w:szCs w:val="28"/>
+          <w:lang w:val="en-US"/>
+        </w:rPr>
+      </w:pPr>
+    </w:p>
+    <w:p>
+      <w:pPr>
+        <w:pStyle w:val="ListParagraph"/>
+        <w:ind w:left="0"/>
+        <w:rPr>
+          <w:b/>
+          <w:bCs/>
+          <w:sz w:val="28"/>
+          <w:szCs w:val="28"/>
+          <w:lang w:val="en-US"/>
+        </w:rPr>
+      </w:pPr>
+      <w:r>
+        <w:rPr>
+          <w:b/>
+          <w:bCs/>
+          <w:sz w:val="28"/>
+          <w:szCs w:val="28"/>
+          <w:lang w:val="en-US"/>
+        </w:rPr>
+        <w:lastRenderedPageBreak/>
+        <w:t>Program Counter (Simulation picture &amp; Logs)</w:t>
+      </w:r>
+    </w:p>
+    <w:p>
+      <w:pPr>
+        <w:pStyle w:val="ListParagraph"/>
+        <w:ind w:left="0"/>
+        <w:rPr>
+          <w:b/>
+          <w:bCs/>
+          <w:sz w:val="28"/>
+          <w:szCs w:val="28"/>
+          <w:lang w:val="en-US"/>
+        </w:rPr>
+      </w:pPr>
+      <w:r>
+        <w:rPr>
+          <w:b/>
+          <w:bCs/>
+          <w:sz w:val="28"/>
+          <w:szCs w:val="28"/>
+          <w:lang w:val="en-US"/>
+        </w:rPr>
+        <w:drawing>
+          <wp:inline distT="0" distB="0" distL="0" distR="0" wp14:anchorId="4D5D7573" wp14:editId="23749707">
+            <wp:extent cx="5940425" cy="1174750"/>
+            <wp:effectExtent l="0" t="0" r="3175" b="6350"/>
+            <wp:docPr id="2" name="Picture 2"/>
+            <wp:cNvGraphicFramePr>
+              <a:graphicFrameLocks xmlns:a="http://schemas.openxmlformats.org/drawingml/2006/main" noChangeAspect="1"/>
+            </wp:cNvGraphicFramePr>
+            <a:graphic xmlns:a="http://schemas.openxmlformats.org/drawingml/2006/main">
+              <a:graphicData uri="http://schemas.openxmlformats.org/drawingml/2006/picture">
+                <pic:pic xmlns:pic="http://schemas.openxmlformats.org/drawingml/2006/picture">
+                  <pic:nvPicPr>
+                    <pic:cNvPr id="1" name=""/>
+                    <pic:cNvPicPr/>
+                  </pic:nvPicPr>
+                  <pic:blipFill>
+                    <a:blip r:embed="rId11"/>
+                    <a:stretch>
+                      <a:fillRect/>
+                    </a:stretch>
+                  </pic:blipFill>
+                  <pic:spPr>
+                    <a:xfrm>
+                      <a:off x="0" y="0"/>
+                      <a:ext cx="5940425" cy="1174750"/>
+                    </a:xfrm>
+                    <a:prstGeom prst="rect">
+                      <a:avLst/>
+                    </a:prstGeom>
+                  </pic:spPr>
+                </pic:pic>
+              </a:graphicData>
+            </a:graphic>
+          </wp:inline>
+        </w:drawing>
+      </w:r>
+    </w:p>
+    <w:p>
+      <w:pPr>
+        <w:pStyle w:val="ListParagraph"/>
+        <w:rPr>
+          <w:sz w:val="28"/>
+          <w:szCs w:val="28"/>
+          <w:lang w:val="en-US"/>
+        </w:rPr>
+      </w:pPr>
+      <w:r>
+        <w:rPr>
+          <w:sz w:val="28"/>
+          <w:szCs w:val="28"/>
+          <w:lang w:val="en-US"/>
+        </w:rPr>
+        <w:t>SUCCESS: Expected instruction address ( 19) was received correctly</w:t>
+      </w:r>
+    </w:p>
+    <w:p>
+      <w:pPr>
+        <w:pStyle w:val="ListParagraph"/>
+        <w:rPr>
+          <w:sz w:val="28"/>
+          <w:szCs w:val="28"/>
+          <w:lang w:val="en-US"/>
+        </w:rPr>
+      </w:pPr>
+      <w:r>
+        <w:rPr>
+          <w:sz w:val="28"/>
+          <w:szCs w:val="28"/>
+          <w:lang w:val="en-US"/>
+        </w:rPr>
+        <w:t>SUCCESS: Expected instruction address ( 20) was received correctly</w:t>
+      </w:r>
+    </w:p>
+    <w:p>
+      <w:pPr>
+        <w:pStyle w:val="ListParagraph"/>
+        <w:rPr>
+          <w:sz w:val="28"/>
+          <w:szCs w:val="28"/>
+          <w:lang w:val="en-US"/>
+        </w:rPr>
+      </w:pPr>
+      <w:r>
+        <w:rPr>
+          <w:sz w:val="28"/>
+          <w:szCs w:val="28"/>
+          <w:lang w:val="en-US"/>
+        </w:rPr>
+        <w:t>SUCCESS: Expected instruction address (  0) was received correctly</w:t>
+      </w:r>
+    </w:p>
+    <w:p>
+      <w:pPr>
+        <w:pStyle w:val="ListParagraph"/>
+        <w:ind w:left="0"/>
+        <w:rPr>
+          <w:sz w:val="28"/>
+          <w:szCs w:val="28"/>
+          <w:lang w:val="en-US"/>
+        </w:rPr>
+      </w:pPr>
+      <w:r>
+        <w:rPr>
+          <w:sz w:val="28"/>
+          <w:szCs w:val="28"/>
+          <w:lang w:val="en-US"/>
+        </w:rPr>
+        <w:tab/>
+      </w:r>
+      <w:r>
+        <w:rPr>
+          <w:sz w:val="28"/>
+          <w:szCs w:val="28"/>
+          <w:lang w:val="en-US"/>
+        </w:rPr>
+        <w:t>SUCCESS: Expected instruction address was not changed  0</w:t>
       </w:r>
     </w:p>
     <w:sectPr>

</xml_diff>

<commit_message>
Add Control Unit module and change ALU commands codes
</commit_message>
<xml_diff>
--- a/SystemVerilog_8-bit_CPU__Description.docx
+++ b/SystemVerilog_8-bit_CPU__Description.docx
@@ -13,6 +13,7 @@
           <w:lang w:val="en-US"/>
         </w:rPr>
       </w:pPr>
+      <w:proofErr w:type="spellStart"/>
       <w:r>
         <w:rPr>
           <w:b/>
@@ -41,7 +42,18 @@
           <w:szCs w:val="40"/>
           <w:lang w:val="en-US"/>
         </w:rPr>
-        <w:t>temVerilog 8-bit CPU</w:t>
+        <w:t>temVerilog</w:t>
+      </w:r>
+      <w:proofErr w:type="spellEnd"/>
+      <w:r>
+        <w:rPr>
+          <w:b/>
+          <w:bCs/>
+          <w:sz w:val="40"/>
+          <w:szCs w:val="40"/>
+          <w:lang w:val="en-US"/>
+        </w:rPr>
+        <w:t xml:space="preserve"> 8-bit CPU</w:t>
       </w:r>
     </w:p>
     <w:p>
@@ -238,7 +250,29 @@
           <w:szCs w:val="28"/>
           <w:lang w:val="en-US"/>
         </w:rPr>
-        <w:t>Hardware description (SystemVerilog &amp; Simulation)</w:t>
+        <w:t>Hardware description (</w:t>
+      </w:r>
+      <w:proofErr w:type="spellStart"/>
+      <w:r>
+        <w:rPr>
+          <w:b/>
+          <w:bCs/>
+          <w:sz w:val="28"/>
+          <w:szCs w:val="28"/>
+          <w:lang w:val="en-US"/>
+        </w:rPr>
+        <w:t>SystemVerilog</w:t>
+      </w:r>
+      <w:proofErr w:type="spellEnd"/>
+      <w:r>
+        <w:rPr>
+          <w:b/>
+          <w:bCs/>
+          <w:sz w:val="28"/>
+          <w:szCs w:val="28"/>
+          <w:lang w:val="en-US"/>
+        </w:rPr>
+        <w:t xml:space="preserve"> &amp; Simulation)</w:t>
       </w:r>
     </w:p>
     <w:p>
@@ -902,7 +936,25 @@
           <w:szCs w:val="28"/>
           <w:lang w:val="en-US"/>
         </w:rPr>
-        <w:t>The primary goal of this project is the design, SystemVerilog implementation, and functional verification of an 8-bit Central Processing Unit (CPU). Following the hardware realization, a custom software ecosystem</w:t>
+        <w:t xml:space="preserve">The primary goal of this project is the design, </w:t>
+      </w:r>
+      <w:proofErr w:type="spellStart"/>
+      <w:r>
+        <w:rPr>
+          <w:sz w:val="28"/>
+          <w:szCs w:val="28"/>
+          <w:lang w:val="en-US"/>
+        </w:rPr>
+        <w:t>SystemVerilog</w:t>
+      </w:r>
+      <w:proofErr w:type="spellEnd"/>
+      <w:r>
+        <w:rPr>
+          <w:sz w:val="28"/>
+          <w:szCs w:val="28"/>
+          <w:lang w:val="en-US"/>
+        </w:rPr>
+        <w:t xml:space="preserve"> implementation, and functional verification of an 8-bit Central Processing Unit (CPU). Following the hardware realization, a custom software ecosystem</w:t>
       </w:r>
       <w:r>
         <w:rPr>
@@ -1463,7 +1515,29 @@
           <w:lang w:val="en-US"/>
         </w:rPr>
         <w:lastRenderedPageBreak/>
-        <w:t>Hardware description (SystemVerilog &amp; Simulation)</w:t>
+        <w:t>Hardware description (</w:t>
+      </w:r>
+      <w:proofErr w:type="spellStart"/>
+      <w:r>
+        <w:rPr>
+          <w:b/>
+          <w:bCs/>
+          <w:sz w:val="40"/>
+          <w:szCs w:val="40"/>
+          <w:lang w:val="en-US"/>
+        </w:rPr>
+        <w:t>SystemVerilog</w:t>
+      </w:r>
+      <w:proofErr w:type="spellEnd"/>
+      <w:r>
+        <w:rPr>
+          <w:b/>
+          <w:bCs/>
+          <w:sz w:val="40"/>
+          <w:szCs w:val="40"/>
+          <w:lang w:val="en-US"/>
+        </w:rPr>
+        <w:t xml:space="preserve"> &amp; Simulation)</w:t>
       </w:r>
     </w:p>
     <w:p>
@@ -1581,13 +1655,41 @@
         </w:rPr>
         <w:br/>
       </w:r>
-      <w:r>
-        <w:rPr>
-          <w:sz w:val="28"/>
-          <w:szCs w:val="28"/>
-          <w:lang w:val="en-US"/>
-        </w:rPr>
-        <w:t xml:space="preserve">ALU module is mathematical and logical controller implementing such commands. This part of CPU is built asynchronously (there is no clk / reset </w:t>
+      <w:proofErr w:type="spellStart"/>
+      <w:r>
+        <w:rPr>
+          <w:sz w:val="28"/>
+          <w:szCs w:val="28"/>
+          <w:lang w:val="en-US"/>
+        </w:rPr>
+        <w:t>ALU</w:t>
+      </w:r>
+      <w:proofErr w:type="spellEnd"/>
+      <w:r>
+        <w:rPr>
+          <w:sz w:val="28"/>
+          <w:szCs w:val="28"/>
+          <w:lang w:val="en-US"/>
+        </w:rPr>
+        <w:t xml:space="preserve"> module is mathematical and logical controller implementing such commands. This part of CPU is built asynchronously (there is no </w:t>
+      </w:r>
+      <w:proofErr w:type="spellStart"/>
+      <w:r>
+        <w:rPr>
+          <w:sz w:val="28"/>
+          <w:szCs w:val="28"/>
+          <w:lang w:val="en-US"/>
+        </w:rPr>
+        <w:t>clk</w:t>
+      </w:r>
+      <w:proofErr w:type="spellEnd"/>
+      <w:r>
+        <w:rPr>
+          <w:sz w:val="28"/>
+          <w:szCs w:val="28"/>
+          <w:lang w:val="en-US"/>
+        </w:rPr>
+        <w:t xml:space="preserve"> / reset </w:t>
       </w:r>
       <w:r>
         <w:rPr>
@@ -1646,7 +1748,7 @@
           <w:szCs w:val="28"/>
           <w:lang w:val="en-US"/>
         </w:rPr>
-        <w:t>–</w:t>
+        <w:t>-</w:t>
       </w:r>
       <w:r>
         <w:rPr>
@@ -1664,7 +1766,15 @@
           <w:szCs w:val="28"/>
           <w:lang w:val="en-US"/>
         </w:rPr>
-        <w:t>0000</w:t>
+        <w:t>000</w:t>
+      </w:r>
+      <w:r>
+        <w:rPr>
+          <w:sz w:val="28"/>
+          <w:szCs w:val="28"/>
+          <w:lang w:val="en-US"/>
+        </w:rPr>
+        <w:t>1</w:t>
       </w:r>
     </w:p>
     <w:p>
@@ -1698,7 +1808,23 @@
           <w:szCs w:val="28"/>
           <w:lang w:val="en-US"/>
         </w:rPr>
-        <w:t>- 0001</w:t>
+        <w:t>- 00</w:t>
+      </w:r>
+      <w:r>
+        <w:rPr>
+          <w:sz w:val="28"/>
+          <w:szCs w:val="28"/>
+          <w:lang w:val="en-US"/>
+        </w:rPr>
+        <w:t>1</w:t>
+      </w:r>
+      <w:r>
+        <w:rPr>
+          <w:sz w:val="28"/>
+          <w:szCs w:val="28"/>
+          <w:lang w:val="en-US"/>
+        </w:rPr>
+        <w:t>1</w:t>
       </w:r>
     </w:p>
     <w:p>
@@ -1732,15 +1858,23 @@
           <w:szCs w:val="28"/>
           <w:lang w:val="en-US"/>
         </w:rPr>
-        <w:t>–</w:t>
-      </w:r>
-      <w:r>
-        <w:rPr>
-          <w:sz w:val="28"/>
-          <w:szCs w:val="28"/>
-          <w:lang w:val="en-US"/>
-        </w:rPr>
-        <w:t xml:space="preserve"> 0110</w:t>
+        <w:t>-</w:t>
+      </w:r>
+      <w:r>
+        <w:rPr>
+          <w:sz w:val="28"/>
+          <w:szCs w:val="28"/>
+          <w:lang w:val="en-US"/>
+        </w:rPr>
+        <w:t xml:space="preserve"> 011</w:t>
+      </w:r>
+      <w:r>
+        <w:rPr>
+          <w:sz w:val="28"/>
+          <w:szCs w:val="28"/>
+          <w:lang w:val="en-US"/>
+        </w:rPr>
+        <w:t>1</w:t>
       </w:r>
     </w:p>
     <w:p>
@@ -1794,7 +1928,7 @@
           <w:szCs w:val="28"/>
           <w:lang w:val="en-US"/>
         </w:rPr>
-        <w:t>-1001</w:t>
+        <w:t>- 1111</w:t>
       </w:r>
     </w:p>
     <w:p>
@@ -1838,15 +1972,23 @@
           <w:szCs w:val="28"/>
           <w:lang w:val="en-US"/>
         </w:rPr>
-        <w:t>–</w:t>
-      </w:r>
-      <w:r>
-        <w:rPr>
-          <w:sz w:val="28"/>
-          <w:szCs w:val="28"/>
-          <w:lang w:val="en-US"/>
-        </w:rPr>
-        <w:t xml:space="preserve"> 0010</w:t>
+        <w:t>-</w:t>
+      </w:r>
+      <w:r>
+        <w:rPr>
+          <w:sz w:val="28"/>
+          <w:szCs w:val="28"/>
+          <w:lang w:val="en-US"/>
+        </w:rPr>
+        <w:t xml:space="preserve"> </w:t>
+      </w:r>
+      <w:r>
+        <w:rPr>
+          <w:sz w:val="28"/>
+          <w:szCs w:val="28"/>
+          <w:lang w:val="en-US"/>
+        </w:rPr>
+        <w:t>1000</w:t>
       </w:r>
     </w:p>
     <w:p>
@@ -1890,15 +2032,23 @@
           <w:szCs w:val="28"/>
           <w:lang w:val="en-US"/>
         </w:rPr>
-        <w:t>–</w:t>
-      </w:r>
-      <w:r>
-        <w:rPr>
-          <w:sz w:val="28"/>
-          <w:szCs w:val="28"/>
-          <w:lang w:val="en-US"/>
-        </w:rPr>
-        <w:t xml:space="preserve"> 0100</w:t>
+        <w:t>-</w:t>
+      </w:r>
+      <w:r>
+        <w:rPr>
+          <w:sz w:val="28"/>
+          <w:szCs w:val="28"/>
+          <w:lang w:val="en-US"/>
+        </w:rPr>
+        <w:t xml:space="preserve"> </w:t>
+      </w:r>
+      <w:r>
+        <w:rPr>
+          <w:sz w:val="28"/>
+          <w:szCs w:val="28"/>
+          <w:lang w:val="en-US"/>
+        </w:rPr>
+        <w:t>1100</w:t>
       </w:r>
     </w:p>
     <w:p>
@@ -1942,15 +2092,23 @@
           <w:szCs w:val="28"/>
           <w:lang w:val="en-US"/>
         </w:rPr>
-        <w:t>–</w:t>
-      </w:r>
-      <w:r>
-        <w:rPr>
-          <w:sz w:val="28"/>
-          <w:szCs w:val="28"/>
-          <w:lang w:val="en-US"/>
-        </w:rPr>
-        <w:t xml:space="preserve"> 1000</w:t>
+        <w:t>-</w:t>
+      </w:r>
+      <w:r>
+        <w:rPr>
+          <w:sz w:val="28"/>
+          <w:szCs w:val="28"/>
+          <w:lang w:val="en-US"/>
+        </w:rPr>
+        <w:t xml:space="preserve"> 1</w:t>
+      </w:r>
+      <w:r>
+        <w:rPr>
+          <w:sz w:val="28"/>
+          <w:szCs w:val="28"/>
+          <w:lang w:val="en-US"/>
+        </w:rPr>
+        <w:t>110</w:t>
       </w:r>
     </w:p>
     <w:p>
@@ -1994,7 +2152,15 @@
           <w:szCs w:val="28"/>
           <w:lang w:val="en-US"/>
         </w:rPr>
-        <w:t>- 0011</w:t>
+        <w:t xml:space="preserve">- </w:t>
+      </w:r>
+      <w:r>
+        <w:rPr>
+          <w:sz w:val="28"/>
+          <w:szCs w:val="28"/>
+          <w:lang w:val="en-US"/>
+        </w:rPr>
+        <w:t>0101</w:t>
       </w:r>
     </w:p>
     <w:p>
@@ -2038,7 +2204,15 @@
           <w:szCs w:val="28"/>
           <w:lang w:val="en-US"/>
         </w:rPr>
-        <w:t>- 0111</w:t>
+        <w:t xml:space="preserve">- </w:t>
+      </w:r>
+      <w:r>
+        <w:rPr>
+          <w:sz w:val="28"/>
+          <w:szCs w:val="28"/>
+          <w:lang w:val="en-US"/>
+        </w:rPr>
+        <w:t>1010</w:t>
       </w:r>
     </w:p>
     <w:p>
@@ -2082,15 +2256,23 @@
           <w:szCs w:val="28"/>
           <w:lang w:val="en-US"/>
         </w:rPr>
-        <w:t>–</w:t>
-      </w:r>
-      <w:r>
-        <w:rPr>
-          <w:sz w:val="28"/>
-          <w:szCs w:val="28"/>
-          <w:lang w:val="en-US"/>
-        </w:rPr>
-        <w:t xml:space="preserve"> 1111</w:t>
+        <w:t>-</w:t>
+      </w:r>
+      <w:r>
+        <w:rPr>
+          <w:sz w:val="28"/>
+          <w:szCs w:val="28"/>
+          <w:lang w:val="en-US"/>
+        </w:rPr>
+        <w:t xml:space="preserve"> </w:t>
+      </w:r>
+      <w:r>
+        <w:rPr>
+          <w:sz w:val="28"/>
+          <w:szCs w:val="28"/>
+          <w:lang w:val="en-US"/>
+        </w:rPr>
+        <w:t>0110</w:t>
       </w:r>
     </w:p>
     <w:p>
@@ -2155,7 +2337,34 @@
           <w:szCs w:val="28"/>
           <w:lang w:val="en-US"/>
         </w:rPr>
-        <w:t>. Read / Write commands are realized in 2 different ways. Reading is executed asynchronously using “assign” operator allows get located data immediately, whereas writing depends on clk signal to avoid ra</w:t>
+        <w:t xml:space="preserve">. Read / Write commands are realized in 2 different ways. Reading is executed asynchronously using “assign” operator allows get located data immediately, whereas writing depends on </w:t>
+      </w:r>
+      <w:proofErr w:type="spellStart"/>
+      <w:r>
+        <w:rPr>
+          <w:sz w:val="28"/>
+          <w:szCs w:val="28"/>
+          <w:lang w:val="en-US"/>
+        </w:rPr>
+        <w:t>clk</w:t>
+      </w:r>
+      <w:proofErr w:type="spellEnd"/>
+      <w:r>
+        <w:rPr>
+          <w:sz w:val="28"/>
+          <w:szCs w:val="28"/>
+          <w:lang w:val="en-US"/>
+        </w:rPr>
+        <w:t xml:space="preserve"> signal to avoid </w:t>
+      </w:r>
+      <w:proofErr w:type="spellStart"/>
+      <w:r>
+        <w:rPr>
+          <w:sz w:val="28"/>
+          <w:szCs w:val="28"/>
+          <w:lang w:val="en-US"/>
+        </w:rPr>
+        <w:t>ra</w:t>
       </w:r>
       <w:r>
         <w:rPr>
@@ -2164,6 +2373,7 @@
         </w:rPr>
         <w:t>сы</w:t>
       </w:r>
+      <w:proofErr w:type="spellEnd"/>
       <w:r>
         <w:rPr>
           <w:sz w:val="28"/>
@@ -2292,27 +2502,7 @@
           <w:szCs w:val="28"/>
           <w:lang w:val="en-US"/>
         </w:rPr>
-        <w:t>Data</w:t>
-      </w:r>
-      <w:r>
-        <w:rPr>
-          <w:b/>
-          <w:bCs/>
-          <w:sz w:val="28"/>
-          <w:szCs w:val="28"/>
-          <w:lang w:val="en-US"/>
-        </w:rPr>
-        <w:t xml:space="preserve"> </w:t>
-      </w:r>
-      <w:r>
-        <w:rPr>
-          <w:b/>
-          <w:bCs/>
-          <w:sz w:val="28"/>
-          <w:szCs w:val="28"/>
-          <w:lang w:val="en-US"/>
-        </w:rPr>
-        <w:t>Memory</w:t>
+        <w:t>Data Memory</w:t>
       </w:r>
       <w:r>
         <w:rPr>
@@ -2396,20 +2586,12 @@
           <w:szCs w:val="28"/>
           <w:lang w:val="en-US"/>
         </w:rPr>
-        <w:t xml:space="preserve">Instruction </w:t>
-      </w:r>
-      <w:r>
-        <w:rPr>
-          <w:b/>
-          <w:bCs/>
-          <w:sz w:val="28"/>
-          <w:szCs w:val="28"/>
-          <w:lang w:val="en-US"/>
-        </w:rPr>
-        <w:t>Memory</w:t>
-      </w:r>
-      <w:r>
-        <w:rPr>
+        <w:t>Instruction memory</w:t>
+      </w:r>
+      <w:r>
+        <w:rPr>
+          <w:b/>
+          <w:bCs/>
           <w:sz w:val="28"/>
           <w:szCs w:val="28"/>
           <w:lang w:val="en-US"/>
@@ -2422,13 +2604,68 @@
           <w:szCs w:val="28"/>
           <w:lang w:val="en-US"/>
         </w:rPr>
-        <w:t>This module is similar to the previous memory block, as it is responsible for storage. The main difference is that it holds program instructions instead of variables and constants. Instructions are read asynchronously during execution, and write functionality is omitted (instructions are pre-loaded prior to execution).</w:t>
-      </w:r>
-    </w:p>
-    <w:p>
-      <w:pPr>
-        <w:pStyle w:val="ListParagraph"/>
-        <w:ind w:left="990"/>
+        <w:t xml:space="preserve">This processor part is similar to the previous, namely, it is responsible for </w:t>
+      </w:r>
+      <w:r>
+        <w:rPr>
+          <w:sz w:val="28"/>
+          <w:szCs w:val="28"/>
+          <w:lang w:val="en-US"/>
+        </w:rPr>
+        <w:t>data storage</w:t>
+      </w:r>
+      <w:r>
+        <w:rPr>
+          <w:sz w:val="28"/>
+          <w:szCs w:val="28"/>
+          <w:lang w:val="en-US"/>
+        </w:rPr>
+        <w:t xml:space="preserve">. The main difference is instructions in place of variables and constants. Instructions can be read during the execution asynchronously, </w:t>
+      </w:r>
+      <w:r>
+        <w:rPr>
+          <w:sz w:val="28"/>
+          <w:szCs w:val="28"/>
+          <w:lang w:val="en-US"/>
+        </w:rPr>
+        <w:t xml:space="preserve">due to the lack of write operations </w:t>
+      </w:r>
+      <w:r>
+        <w:rPr>
+          <w:sz w:val="28"/>
+          <w:szCs w:val="28"/>
+          <w:lang w:val="en-US"/>
+        </w:rPr>
+        <w:t>(instructions are</w:t>
+      </w:r>
+      <w:r>
+        <w:rPr>
+          <w:sz w:val="28"/>
+          <w:szCs w:val="28"/>
+          <w:lang w:val="en-US"/>
+        </w:rPr>
+        <w:t xml:space="preserve"> preloaded </w:t>
+      </w:r>
+      <w:r>
+        <w:rPr>
+          <w:sz w:val="28"/>
+          <w:szCs w:val="28"/>
+          <w:lang w:val="en-US"/>
+        </w:rPr>
+        <w:t xml:space="preserve">prior to execution </w:t>
+      </w:r>
+      <w:r>
+        <w:rPr>
+          <w:sz w:val="28"/>
+          <w:szCs w:val="28"/>
+          <w:lang w:val="en-US"/>
+        </w:rPr>
+        <w:t>time).</w:t>
+      </w:r>
+    </w:p>
+    <w:p>
+      <w:pPr>
+        <w:pStyle w:val="ListParagraph"/>
         <w:rPr>
           <w:sz w:val="28"/>
           <w:szCs w:val="28"/>
@@ -2459,8 +2696,258 @@
           <w:szCs w:val="28"/>
           <w:lang w:val="en-US"/>
         </w:rPr>
-        <w:t>Program Counter</w:t>
-      </w:r>
+        <w:t>Control Unit</w:t>
+      </w:r>
+    </w:p>
+    <w:p>
+      <w:pPr>
+        <w:pStyle w:val="ListParagraph"/>
+        <w:ind w:left="990"/>
+        <w:rPr>
+          <w:sz w:val="28"/>
+          <w:szCs w:val="28"/>
+          <w:lang w:val="en-US"/>
+        </w:rPr>
+      </w:pPr>
+      <w:r>
+        <w:rPr>
+          <w:sz w:val="28"/>
+          <w:szCs w:val="28"/>
+          <w:lang w:val="en-US"/>
+        </w:rPr>
+        <w:t xml:space="preserve">Control unit is </w:t>
+      </w:r>
+      <w:r>
+        <w:rPr>
+          <w:sz w:val="28"/>
+          <w:szCs w:val="28"/>
+          <w:lang w:val="en-US"/>
+        </w:rPr>
+        <w:t xml:space="preserve">logical decoder, namely, it transfers instruction parts to control bits for other parts. </w:t>
+      </w:r>
+      <w:r>
+        <w:rPr>
+          <w:sz w:val="28"/>
+          <w:szCs w:val="28"/>
+          <w:lang w:val="en"/>
+        </w:rPr>
+        <w:t>It receives the current 16-bit instruction word, extracts the 4-bit opcode, and generates a set of combinational control signals</w:t>
+      </w:r>
+      <w:r>
+        <w:rPr>
+          <w:sz w:val="28"/>
+          <w:szCs w:val="28"/>
+          <w:lang w:val="en"/>
+        </w:rPr>
+        <w:t xml:space="preserve">, </w:t>
+      </w:r>
+      <w:r>
+        <w:rPr>
+          <w:sz w:val="28"/>
+          <w:szCs w:val="28"/>
+          <w:lang w:val="en"/>
+        </w:rPr>
+        <w:t>that determine the operating mode of the data path for a single clock cycle.</w:t>
+      </w:r>
+    </w:p>
+    <w:p>
+      <w:pPr>
+        <w:pStyle w:val="ListParagraph"/>
+        <w:ind w:left="990"/>
+        <w:rPr>
+          <w:sz w:val="28"/>
+          <w:szCs w:val="28"/>
+          <w:lang w:val="en-US"/>
+        </w:rPr>
+      </w:pPr>
+      <w:r>
+        <w:rPr>
+          <w:sz w:val="28"/>
+          <w:szCs w:val="28"/>
+          <w:lang w:val="en-US"/>
+        </w:rPr>
+        <w:t xml:space="preserve">The following </w:t>
+      </w:r>
+      <w:r>
+        <w:rPr>
+          <w:sz w:val="28"/>
+          <w:szCs w:val="28"/>
+          <w:lang w:val="en-US"/>
+        </w:rPr>
+        <w:t>control commands are realized:</w:t>
+      </w:r>
+    </w:p>
+    <w:p>
+      <w:pPr>
+        <w:pStyle w:val="ListParagraph"/>
+        <w:numPr>
+          <w:ilvl w:val="0"/>
+          <w:numId w:val="7"/>
+        </w:numPr>
+        <w:rPr>
+          <w:b/>
+          <w:bCs/>
+          <w:sz w:val="28"/>
+          <w:szCs w:val="28"/>
+          <w:lang w:val="en-US"/>
+        </w:rPr>
+      </w:pPr>
+      <w:r>
+        <w:rPr>
+          <w:b/>
+          <w:bCs/>
+          <w:sz w:val="28"/>
+          <w:szCs w:val="28"/>
+          <w:lang w:val="en-US"/>
+        </w:rPr>
+        <w:t>LOADI  (Load constant in register) 1101</w:t>
+      </w:r>
+    </w:p>
+    <w:p>
+      <w:pPr>
+        <w:pStyle w:val="ListParagraph"/>
+        <w:numPr>
+          <w:ilvl w:val="0"/>
+          <w:numId w:val="7"/>
+        </w:numPr>
+        <w:rPr>
+          <w:b/>
+          <w:bCs/>
+          <w:sz w:val="28"/>
+          <w:szCs w:val="28"/>
+          <w:lang w:val="en-US"/>
+        </w:rPr>
+      </w:pPr>
+      <w:r>
+        <w:rPr>
+          <w:b/>
+          <w:bCs/>
+          <w:sz w:val="28"/>
+          <w:szCs w:val="28"/>
+          <w:lang w:val="en-US"/>
+        </w:rPr>
+        <w:t>LOAD (Load value form data memory in register) 1011</w:t>
+      </w:r>
+    </w:p>
+    <w:p>
+      <w:pPr>
+        <w:pStyle w:val="ListParagraph"/>
+        <w:numPr>
+          <w:ilvl w:val="0"/>
+          <w:numId w:val="7"/>
+        </w:numPr>
+        <w:rPr>
+          <w:b/>
+          <w:bCs/>
+          <w:sz w:val="28"/>
+          <w:szCs w:val="28"/>
+          <w:lang w:val="en-US"/>
+        </w:rPr>
+      </w:pPr>
+      <w:r>
+        <w:rPr>
+          <w:b/>
+          <w:bCs/>
+          <w:sz w:val="28"/>
+          <w:szCs w:val="28"/>
+          <w:lang w:val="en-US"/>
+        </w:rPr>
+        <w:t>STORE (Load value from register in data memory) 0100</w:t>
+      </w:r>
+    </w:p>
+    <w:p>
+      <w:pPr>
+        <w:pStyle w:val="ListParagraph"/>
+        <w:numPr>
+          <w:ilvl w:val="0"/>
+          <w:numId w:val="7"/>
+        </w:numPr>
+        <w:rPr>
+          <w:b/>
+          <w:bCs/>
+          <w:sz w:val="28"/>
+          <w:szCs w:val="28"/>
+          <w:lang w:val="en-US"/>
+        </w:rPr>
+      </w:pPr>
+      <w:r>
+        <w:rPr>
+          <w:b/>
+          <w:bCs/>
+          <w:sz w:val="28"/>
+          <w:szCs w:val="28"/>
+          <w:lang w:val="en-US"/>
+        </w:rPr>
+        <w:t>JMP (Move to concrete address) 0010</w:t>
+      </w:r>
+    </w:p>
+    <w:p>
+      <w:pPr>
+        <w:pStyle w:val="ListParagraph"/>
+        <w:numPr>
+          <w:ilvl w:val="0"/>
+          <w:numId w:val="7"/>
+        </w:numPr>
+        <w:rPr>
+          <w:b/>
+          <w:bCs/>
+          <w:sz w:val="28"/>
+          <w:szCs w:val="28"/>
+          <w:lang w:val="en-US"/>
+        </w:rPr>
+      </w:pPr>
+      <w:r>
+        <w:rPr>
+          <w:b/>
+          <w:bCs/>
+          <w:sz w:val="28"/>
+          <w:szCs w:val="28"/>
+          <w:lang w:val="en-US"/>
+        </w:rPr>
+        <w:t>JZ (Move to concrete address if zero) 1001</w:t>
+      </w:r>
+    </w:p>
+    <w:p>
+      <w:pPr>
+        <w:pStyle w:val="ListParagraph"/>
+        <w:ind w:left="1710"/>
+        <w:rPr>
+          <w:b/>
+          <w:bCs/>
+          <w:sz w:val="28"/>
+          <w:szCs w:val="28"/>
+          <w:lang w:val="en-US"/>
+        </w:rPr>
+      </w:pPr>
+    </w:p>
+    <w:p>
+      <w:pPr>
+        <w:pStyle w:val="ListParagraph"/>
+        <w:ind w:left="990"/>
+        <w:rPr>
+          <w:sz w:val="28"/>
+          <w:szCs w:val="28"/>
+          <w:lang w:val="en-US"/>
+        </w:rPr>
+      </w:pPr>
+    </w:p>
+    <w:p>
+      <w:pPr>
+        <w:rPr>
+          <w:sz w:val="28"/>
+          <w:szCs w:val="28"/>
+          <w:lang w:val="en-US"/>
+        </w:rPr>
+      </w:pPr>
+    </w:p>
+    <w:p>
+      <w:pPr>
+        <w:rPr>
+          <w:sz w:val="28"/>
+          <w:szCs w:val="28"/>
+          <w:lang w:val="en-US"/>
+        </w:rPr>
+      </w:pPr>
     </w:p>
     <w:p>
       <w:pPr>
@@ -2593,7 +3080,6 @@
           <w:szCs w:val="28"/>
           <w:lang w:val="en-US"/>
         </w:rPr>
-        <w:lastRenderedPageBreak/>
         <w:t>ALU (Simulation picture &amp; Logs)</w:t>
       </w:r>
       <w:bookmarkEnd w:id="0"/>
@@ -2609,13 +3095,17 @@
       </w:r>
       <w:r>
         <w:rPr>
-          <w:noProof/>
+          <w:b/>
+          <w:bCs/>
+          <w:sz w:val="28"/>
+          <w:szCs w:val="28"/>
+          <w:lang w:val="en-US"/>
         </w:rPr>
         <w:drawing>
-          <wp:inline distT="0" distB="0" distL="0" distR="0" wp14:anchorId="3EEFF4BD" wp14:editId="120CA161">
-            <wp:extent cx="5940425" cy="1614170"/>
-            <wp:effectExtent l="0" t="0" r="3175" b="5080"/>
-            <wp:docPr id="3" name="Picture 3"/>
+          <wp:inline distT="0" distB="0" distL="0" distR="0" wp14:anchorId="4EEF9E16" wp14:editId="7286819D">
+            <wp:extent cx="5940425" cy="1661795"/>
+            <wp:effectExtent l="0" t="0" r="3175" b="0"/>
+            <wp:docPr id="8" name="Picture 8"/>
             <wp:cNvGraphicFramePr>
               <a:graphicFrameLocks xmlns:a="http://schemas.openxmlformats.org/drawingml/2006/main" noChangeAspect="1"/>
             </wp:cNvGraphicFramePr>
@@ -2623,36 +3113,23 @@
               <a:graphicData uri="http://schemas.openxmlformats.org/drawingml/2006/picture">
                 <pic:pic xmlns:pic="http://schemas.openxmlformats.org/drawingml/2006/picture">
                   <pic:nvPicPr>
-                    <pic:cNvPr id="0" name="Picture 1"/>
-                    <pic:cNvPicPr>
-                      <a:picLocks noChangeAspect="1" noChangeArrowheads="1"/>
-                    </pic:cNvPicPr>
+                    <pic:cNvPr id="1" name=""/>
+                    <pic:cNvPicPr/>
                   </pic:nvPicPr>
                   <pic:blipFill>
-                    <a:blip r:embed="rId6" cstate="print">
-                      <a:extLst>
-                        <a:ext uri="{28A0092B-C50C-407E-A947-70E740481C1C}">
-                          <a14:useLocalDpi xmlns:a14="http://schemas.microsoft.com/office/drawing/2010/main" val="0"/>
-                        </a:ext>
-                      </a:extLst>
-                    </a:blip>
-                    <a:srcRect/>
+                    <a:blip r:embed="rId6"/>
                     <a:stretch>
                       <a:fillRect/>
                     </a:stretch>
                   </pic:blipFill>
-                  <pic:spPr bwMode="auto">
+                  <pic:spPr>
                     <a:xfrm>
                       <a:off x="0" y="0"/>
-                      <a:ext cx="5940425" cy="1614170"/>
+                      <a:ext cx="5940425" cy="1661795"/>
                     </a:xfrm>
                     <a:prstGeom prst="rect">
                       <a:avLst/>
                     </a:prstGeom>
-                    <a:noFill/>
-                    <a:ln>
-                      <a:noFill/>
-                    </a:ln>
                   </pic:spPr>
                 </pic:pic>
               </a:graphicData>
@@ -2810,7 +3287,7 @@
           <w:szCs w:val="28"/>
           <w:lang w:val="en-US"/>
         </w:rPr>
-        <w:t>SUCCESS &gt;&gt;&gt;: Expected result (  32) was received correctly</w:t>
+        <w:t>SUCCESS &gt;&gt;&gt;: Expected result (   8) was received correctly</w:t>
       </w:r>
     </w:p>
     <w:p>
@@ -2829,7 +3306,7 @@
           <w:szCs w:val="28"/>
           <w:lang w:val="en-US"/>
         </w:rPr>
-        <w:t>SUCCESS &lt;&lt;&lt;: Expected result (   8) was received correctly</w:t>
+        <w:t>SUCCESS &lt;&lt;&lt;: Expected result (  32) was received correctly</w:t>
       </w:r>
     </w:p>
     <w:p>
@@ -2867,38 +3344,17 @@
           <w:szCs w:val="28"/>
           <w:lang w:val="en-US"/>
         </w:rPr>
-        <w:t>SUCCESS: Default value was set</w:t>
-      </w:r>
-    </w:p>
-    <w:p>
-      <w:pPr>
-        <w:pStyle w:val="ListParagraph"/>
-        <w:ind w:left="990"/>
-        <w:rPr>
-          <w:sz w:val="28"/>
-          <w:szCs w:val="28"/>
-          <w:lang w:val="en-US"/>
-        </w:rPr>
-      </w:pPr>
-      <w:r>
-        <w:rPr>
-          <w:sz w:val="28"/>
-          <w:szCs w:val="28"/>
-          <w:lang w:val="en-US"/>
-        </w:rPr>
+        <w:lastRenderedPageBreak/>
         <w:t>SUCCESS: (+) Overflow was set</w:t>
       </w:r>
-    </w:p>
-    <w:p>
-      <w:pPr>
-        <w:pStyle w:val="ListParagraph"/>
-        <w:ind w:left="990"/>
-        <w:rPr>
-          <w:sz w:val="28"/>
-          <w:szCs w:val="28"/>
-          <w:lang w:val="en-US"/>
-        </w:rPr>
-      </w:pPr>
+      <w:r>
+        <w:rPr>
+          <w:sz w:val="28"/>
+          <w:szCs w:val="28"/>
+          <w:lang w:val="en-US"/>
+        </w:rPr>
+        <w:br/>
+      </w:r>
       <w:r>
         <w:rPr>
           <w:sz w:val="28"/>
@@ -3162,7 +3618,6 @@
           <w:szCs w:val="28"/>
           <w:lang w:val="en-US"/>
         </w:rPr>
-        <w:lastRenderedPageBreak/>
         <w:drawing>
           <wp:inline distT="0" distB="0" distL="0" distR="0" wp14:anchorId="63CCA24F" wp14:editId="38135F44">
             <wp:extent cx="5940425" cy="1023620"/>
@@ -3249,7 +3704,25 @@
           <w:szCs w:val="28"/>
           <w:lang w:val="en-US"/>
         </w:rPr>
-        <w:t>SUCCESS: carry_out flag was set correctly (1)</w:t>
+        <w:t xml:space="preserve">SUCCESS: </w:t>
+      </w:r>
+      <w:proofErr w:type="spellStart"/>
+      <w:r>
+        <w:rPr>
+          <w:sz w:val="28"/>
+          <w:szCs w:val="28"/>
+          <w:lang w:val="en-US"/>
+        </w:rPr>
+        <w:t>carry_out</w:t>
+      </w:r>
+      <w:proofErr w:type="spellEnd"/>
+      <w:r>
+        <w:rPr>
+          <w:sz w:val="28"/>
+          <w:szCs w:val="28"/>
+          <w:lang w:val="en-US"/>
+        </w:rPr>
+        <w:t xml:space="preserve"> flag was set correctly (1)</w:t>
       </w:r>
     </w:p>
     <w:p>
@@ -3353,7 +3826,23 @@
           <w:szCs w:val="28"/>
           <w:lang w:val="en-US"/>
         </w:rPr>
-        <w:t>SUCCESS: carry_out flag was set correctly (0)</w:t>
+        <w:t>SUCCESS: carry</w:t>
+      </w:r>
+      <w:r>
+        <w:rPr>
+          <w:sz w:val="28"/>
+          <w:szCs w:val="28"/>
+          <w:lang w:val="en-US"/>
+        </w:rPr>
+        <w:t xml:space="preserve"> </w:t>
+      </w:r>
+      <w:r>
+        <w:rPr>
+          <w:sz w:val="28"/>
+          <w:szCs w:val="28"/>
+          <w:lang w:val="en-US"/>
+        </w:rPr>
+        <w:t>out flag was set correctly (0)</w:t>
       </w:r>
     </w:p>
     <w:p>
@@ -3520,6 +4009,7 @@
           <w:szCs w:val="28"/>
           <w:lang w:val="en-US"/>
         </w:rPr>
+        <w:lastRenderedPageBreak/>
         <w:t>SUCCESS: Expected data (  13) was written to the address cell   0</w:t>
       </w:r>
     </w:p>
@@ -3607,50 +4097,33 @@
         <w:pStyle w:val="ListParagraph"/>
         <w:ind w:left="0"/>
         <w:rPr>
-          <w:b/>
-          <w:bCs/>
-          <w:sz w:val="28"/>
-          <w:szCs w:val="28"/>
-          <w:lang w:val="en-US"/>
-        </w:rPr>
-      </w:pPr>
-      <w:r>
-        <w:rPr>
-          <w:sz w:val="28"/>
-          <w:szCs w:val="28"/>
-          <w:lang w:val="en-US"/>
-        </w:rPr>
-        <w:br/>
-      </w:r>
-      <w:r>
-        <w:rPr>
-          <w:b/>
-          <w:bCs/>
-          <w:sz w:val="28"/>
-          <w:szCs w:val="28"/>
-          <w:lang w:val="en-US"/>
-        </w:rPr>
-        <w:t xml:space="preserve">Instruction </w:t>
-      </w:r>
-      <w:r>
-        <w:rPr>
-          <w:b/>
-          <w:bCs/>
-          <w:sz w:val="28"/>
-          <w:szCs w:val="28"/>
-          <w:lang w:val="en-US"/>
-        </w:rPr>
-        <w:t>Memory</w:t>
-      </w:r>
-      <w:r>
-        <w:rPr>
-          <w:b/>
-          <w:bCs/>
-          <w:sz w:val="28"/>
-          <w:szCs w:val="28"/>
-          <w:lang w:val="en-US"/>
-        </w:rPr>
-        <w:t xml:space="preserve"> </w:t>
+          <w:sz w:val="28"/>
+          <w:szCs w:val="28"/>
+          <w:lang w:val="en-US"/>
+        </w:rPr>
+      </w:pPr>
+    </w:p>
+    <w:p>
+      <w:pPr>
+        <w:pStyle w:val="ListParagraph"/>
+        <w:ind w:left="0"/>
+        <w:rPr>
+          <w:b/>
+          <w:bCs/>
+          <w:sz w:val="28"/>
+          <w:szCs w:val="28"/>
+          <w:lang w:val="en-US"/>
+        </w:rPr>
+      </w:pPr>
+      <w:r>
+        <w:rPr>
+          <w:b/>
+          <w:bCs/>
+          <w:sz w:val="28"/>
+          <w:szCs w:val="28"/>
+          <w:lang w:val="en-US"/>
+        </w:rPr>
+        <w:t xml:space="preserve">Instruction Memory </w:t>
       </w:r>
       <w:r>
         <w:rPr>
@@ -3662,23 +4135,27 @@
         </w:rPr>
         <w:t>(Simulation picture &amp; Logs)</w:t>
       </w:r>
-      <w:r>
-        <w:rPr>
-          <w:b/>
-          <w:bCs/>
-          <w:sz w:val="28"/>
-          <w:szCs w:val="28"/>
-          <w:lang w:val="en-US"/>
-        </w:rPr>
-        <w:br/>
-      </w:r>
+    </w:p>
+    <w:p>
+      <w:pPr>
+        <w:pStyle w:val="ListParagraph"/>
+        <w:ind w:left="0"/>
+        <w:rPr>
+          <w:sz w:val="28"/>
+          <w:szCs w:val="28"/>
+          <w:lang w:val="en-US"/>
+        </w:rPr>
+      </w:pPr>
       <w:r>
         <w:rPr>
           <w:noProof/>
+          <w:sz w:val="28"/>
+          <w:szCs w:val="28"/>
+          <w:lang w:val="en-US"/>
         </w:rPr>
         <w:drawing>
-          <wp:inline distT="0" distB="0" distL="0" distR="0" wp14:anchorId="4A82074F" wp14:editId="4AD2BF95">
-            <wp:extent cx="5940425" cy="840740"/>
+          <wp:inline distT="0" distB="0" distL="0" distR="0" wp14:anchorId="649D778D" wp14:editId="470C155C">
+            <wp:extent cx="5940425" cy="840105"/>
             <wp:effectExtent l="0" t="0" r="3175" b="0"/>
             <wp:docPr id="7" name="Picture 7"/>
             <wp:cNvGraphicFramePr>
@@ -3688,36 +4165,23 @@
               <a:graphicData uri="http://schemas.openxmlformats.org/drawingml/2006/picture">
                 <pic:pic xmlns:pic="http://schemas.openxmlformats.org/drawingml/2006/picture">
                   <pic:nvPicPr>
-                    <pic:cNvPr id="0" name="Picture 6"/>
-                    <pic:cNvPicPr>
-                      <a:picLocks noChangeAspect="1" noChangeArrowheads="1"/>
-                    </pic:cNvPicPr>
+                    <pic:cNvPr id="1" name=""/>
+                    <pic:cNvPicPr/>
                   </pic:nvPicPr>
                   <pic:blipFill>
-                    <a:blip r:embed="rId10" cstate="print">
-                      <a:extLst>
-                        <a:ext uri="{28A0092B-C50C-407E-A947-70E740481C1C}">
-                          <a14:useLocalDpi xmlns:a14="http://schemas.microsoft.com/office/drawing/2010/main" val="0"/>
-                        </a:ext>
-                      </a:extLst>
-                    </a:blip>
-                    <a:srcRect/>
+                    <a:blip r:embed="rId10"/>
                     <a:stretch>
                       <a:fillRect/>
                     </a:stretch>
                   </pic:blipFill>
-                  <pic:spPr bwMode="auto">
+                  <pic:spPr>
                     <a:xfrm>
                       <a:off x="0" y="0"/>
-                      <a:ext cx="5940425" cy="840740"/>
+                      <a:ext cx="5940425" cy="840105"/>
                     </a:xfrm>
                     <a:prstGeom prst="rect">
                       <a:avLst/>
                     </a:prstGeom>
-                    <a:noFill/>
-                    <a:ln>
-                      <a:noFill/>
-                    </a:ln>
                   </pic:spPr>
                 </pic:pic>
               </a:graphicData>
@@ -3805,11 +4269,33 @@
         <w:pStyle w:val="ListParagraph"/>
         <w:ind w:left="0"/>
         <w:rPr>
-          <w:sz w:val="28"/>
-          <w:szCs w:val="28"/>
-          <w:lang w:val="en-US"/>
-        </w:rPr>
-      </w:pPr>
+          <w:b/>
+          <w:bCs/>
+          <w:sz w:val="28"/>
+          <w:szCs w:val="28"/>
+          <w:lang w:val="en-US"/>
+        </w:rPr>
+      </w:pPr>
+      <w:r>
+        <w:rPr>
+          <w:b/>
+          <w:bCs/>
+          <w:sz w:val="28"/>
+          <w:szCs w:val="28"/>
+          <w:lang w:val="en-US"/>
+        </w:rPr>
+        <w:t>Control Unit</w:t>
+      </w:r>
+      <w:r>
+        <w:rPr>
+          <w:b/>
+          <w:bCs/>
+          <w:sz w:val="28"/>
+          <w:szCs w:val="28"/>
+          <w:lang w:val="en-US"/>
+        </w:rPr>
+        <w:t xml:space="preserve"> (Simulation picture &amp; Logs)</w:t>
+      </w:r>
     </w:p>
     <w:p>
       <w:pPr>
@@ -3821,77 +4307,17 @@
           <w:lang w:val="en-US"/>
         </w:rPr>
       </w:pPr>
-    </w:p>
-    <w:p>
-      <w:pPr>
-        <w:pStyle w:val="ListParagraph"/>
-        <w:ind w:left="0"/>
-        <w:rPr>
-          <w:sz w:val="28"/>
-          <w:szCs w:val="28"/>
-          <w:lang w:val="en-US"/>
-        </w:rPr>
-      </w:pPr>
-    </w:p>
-    <w:p>
-      <w:pPr>
-        <w:pStyle w:val="ListParagraph"/>
-        <w:ind w:left="0"/>
-        <w:rPr>
-          <w:sz w:val="28"/>
-          <w:szCs w:val="28"/>
-          <w:lang w:val="en-US"/>
-        </w:rPr>
-      </w:pPr>
-    </w:p>
-    <w:p>
-      <w:pPr>
-        <w:pStyle w:val="ListParagraph"/>
-        <w:ind w:left="0"/>
-        <w:rPr>
-          <w:b/>
-          <w:bCs/>
-          <w:sz w:val="28"/>
-          <w:szCs w:val="28"/>
-          <w:lang w:val="en-US"/>
-        </w:rPr>
-      </w:pPr>
-      <w:r>
-        <w:rPr>
-          <w:b/>
-          <w:bCs/>
-          <w:sz w:val="28"/>
-          <w:szCs w:val="28"/>
-          <w:lang w:val="en-US"/>
-        </w:rPr>
-        <w:lastRenderedPageBreak/>
-        <w:t>Program Counter (Simulation picture &amp; Logs)</w:t>
-      </w:r>
-    </w:p>
-    <w:p>
-      <w:pPr>
-        <w:pStyle w:val="ListParagraph"/>
-        <w:ind w:left="0"/>
-        <w:rPr>
-          <w:b/>
-          <w:bCs/>
-          <w:sz w:val="28"/>
-          <w:szCs w:val="28"/>
-          <w:lang w:val="en-US"/>
-        </w:rPr>
-      </w:pPr>
-      <w:r>
-        <w:rPr>
-          <w:b/>
-          <w:bCs/>
+      <w:r>
+        <w:rPr>
+          <w:noProof/>
           <w:sz w:val="28"/>
           <w:szCs w:val="28"/>
           <w:lang w:val="en-US"/>
         </w:rPr>
         <w:drawing>
-          <wp:inline distT="0" distB="0" distL="0" distR="0" wp14:anchorId="4D5D7573" wp14:editId="23749707">
-            <wp:extent cx="5940425" cy="1174750"/>
-            <wp:effectExtent l="0" t="0" r="3175" b="6350"/>
+          <wp:inline distT="0" distB="0" distL="0" distR="0" wp14:anchorId="06E4A94E" wp14:editId="347FF71C">
+            <wp:extent cx="5940425" cy="1816100"/>
+            <wp:effectExtent l="0" t="0" r="3175" b="0"/>
             <wp:docPr id="2" name="Picture 2"/>
             <wp:cNvGraphicFramePr>
               <a:graphicFrameLocks xmlns:a="http://schemas.openxmlformats.org/drawingml/2006/main" noChangeAspect="1"/>
@@ -3912,7 +4338,7 @@
                   <pic:spPr>
                     <a:xfrm>
                       <a:off x="0" y="0"/>
-                      <a:ext cx="5940425" cy="1174750"/>
+                      <a:ext cx="5940425" cy="1816100"/>
                     </a:xfrm>
                     <a:prstGeom prst="rect">
                       <a:avLst/>
@@ -3924,59 +4350,183 @@
           </wp:inline>
         </w:drawing>
       </w:r>
-    </w:p>
-    <w:p>
-      <w:pPr>
-        <w:pStyle w:val="ListParagraph"/>
-        <w:rPr>
-          <w:sz w:val="28"/>
-          <w:szCs w:val="28"/>
-          <w:lang w:val="en-US"/>
-        </w:rPr>
-      </w:pPr>
-      <w:r>
-        <w:rPr>
-          <w:sz w:val="28"/>
-          <w:szCs w:val="28"/>
-          <w:lang w:val="en-US"/>
-        </w:rPr>
-        <w:t>SUCCESS: Expected instruction address ( 19) was received correctly</w:t>
-      </w:r>
-    </w:p>
-    <w:p>
-      <w:pPr>
-        <w:pStyle w:val="ListParagraph"/>
-        <w:rPr>
-          <w:sz w:val="28"/>
-          <w:szCs w:val="28"/>
-          <w:lang w:val="en-US"/>
-        </w:rPr>
-      </w:pPr>
-      <w:r>
-        <w:rPr>
-          <w:sz w:val="28"/>
-          <w:szCs w:val="28"/>
-          <w:lang w:val="en-US"/>
-        </w:rPr>
-        <w:t>SUCCESS: Expected instruction address ( 20) was received correctly</w:t>
-      </w:r>
-    </w:p>
-    <w:p>
-      <w:pPr>
-        <w:pStyle w:val="ListParagraph"/>
-        <w:rPr>
-          <w:sz w:val="28"/>
-          <w:szCs w:val="28"/>
-          <w:lang w:val="en-US"/>
-        </w:rPr>
-      </w:pPr>
-      <w:r>
-        <w:rPr>
-          <w:sz w:val="28"/>
-          <w:szCs w:val="28"/>
-          <w:lang w:val="en-US"/>
-        </w:rPr>
-        <w:t>SUCCESS: Expected instruction address (  0) was received correctly</w:t>
+      <w:r>
+        <w:rPr>
+          <w:sz w:val="28"/>
+          <w:szCs w:val="28"/>
+          <w:lang w:val="en-US"/>
+        </w:rPr>
+        <w:tab/>
+      </w:r>
+      <w:r>
+        <w:rPr>
+          <w:sz w:val="28"/>
+          <w:szCs w:val="28"/>
+          <w:lang w:val="en-US"/>
+        </w:rPr>
+        <w:t>SUCCESS LOADI: Expected result (1) was received correctly</w:t>
+      </w:r>
+    </w:p>
+    <w:p>
+      <w:pPr>
+        <w:pStyle w:val="ListParagraph"/>
+        <w:rPr>
+          <w:sz w:val="28"/>
+          <w:szCs w:val="28"/>
+          <w:lang w:val="en-US"/>
+        </w:rPr>
+      </w:pPr>
+      <w:r>
+        <w:rPr>
+          <w:sz w:val="28"/>
+          <w:szCs w:val="28"/>
+          <w:lang w:val="en-US"/>
+        </w:rPr>
+        <w:t>SUCCESS LOADI: Expected result (2) was received correctly</w:t>
+      </w:r>
+    </w:p>
+    <w:p>
+      <w:pPr>
+        <w:pStyle w:val="ListParagraph"/>
+        <w:rPr>
+          <w:sz w:val="28"/>
+          <w:szCs w:val="28"/>
+          <w:lang w:val="en-US"/>
+        </w:rPr>
+      </w:pPr>
+      <w:r>
+        <w:rPr>
+          <w:sz w:val="28"/>
+          <w:szCs w:val="28"/>
+          <w:lang w:val="en-US"/>
+        </w:rPr>
+        <w:t>SUCCESS LOAD: Expected result (1) was received correctly</w:t>
+      </w:r>
+    </w:p>
+    <w:p>
+      <w:pPr>
+        <w:pStyle w:val="ListParagraph"/>
+        <w:rPr>
+          <w:sz w:val="28"/>
+          <w:szCs w:val="28"/>
+          <w:lang w:val="en-US"/>
+        </w:rPr>
+      </w:pPr>
+      <w:r>
+        <w:rPr>
+          <w:sz w:val="28"/>
+          <w:szCs w:val="28"/>
+          <w:lang w:val="en-US"/>
+        </w:rPr>
+        <w:t>SUCCESS LOAD: Expected result (1) was received correctly</w:t>
+      </w:r>
+    </w:p>
+    <w:p>
+      <w:pPr>
+        <w:pStyle w:val="ListParagraph"/>
+        <w:rPr>
+          <w:sz w:val="28"/>
+          <w:szCs w:val="28"/>
+          <w:lang w:val="en-US"/>
+        </w:rPr>
+      </w:pPr>
+      <w:r>
+        <w:rPr>
+          <w:sz w:val="28"/>
+          <w:szCs w:val="28"/>
+          <w:lang w:val="en-US"/>
+        </w:rPr>
+        <w:t>SUCCESS LOAD: Expected result (1) was received correctly</w:t>
+      </w:r>
+    </w:p>
+    <w:p>
+      <w:pPr>
+        <w:pStyle w:val="ListParagraph"/>
+        <w:rPr>
+          <w:sz w:val="28"/>
+          <w:szCs w:val="28"/>
+          <w:lang w:val="en-US"/>
+        </w:rPr>
+      </w:pPr>
+      <w:r>
+        <w:rPr>
+          <w:sz w:val="28"/>
+          <w:szCs w:val="28"/>
+          <w:lang w:val="en-US"/>
+        </w:rPr>
+        <w:t>SUCCESS STORE: Expected result (1) was received correctly</w:t>
+      </w:r>
+    </w:p>
+    <w:p>
+      <w:pPr>
+        <w:pStyle w:val="ListParagraph"/>
+        <w:rPr>
+          <w:sz w:val="28"/>
+          <w:szCs w:val="28"/>
+          <w:lang w:val="en-US"/>
+        </w:rPr>
+      </w:pPr>
+      <w:r>
+        <w:rPr>
+          <w:sz w:val="28"/>
+          <w:szCs w:val="28"/>
+          <w:lang w:val="en-US"/>
+        </w:rPr>
+        <w:t>SUCCESS STORE: Expected result (0) was received correctly</w:t>
+      </w:r>
+    </w:p>
+    <w:p>
+      <w:pPr>
+        <w:pStyle w:val="ListParagraph"/>
+        <w:rPr>
+          <w:sz w:val="28"/>
+          <w:szCs w:val="28"/>
+          <w:lang w:val="en-US"/>
+        </w:rPr>
+      </w:pPr>
+      <w:r>
+        <w:rPr>
+          <w:sz w:val="28"/>
+          <w:szCs w:val="28"/>
+          <w:lang w:val="en-US"/>
+        </w:rPr>
+        <w:t>SUCCESS JMP: Expected result (1) was received correctly</w:t>
+      </w:r>
+    </w:p>
+    <w:p>
+      <w:pPr>
+        <w:pStyle w:val="ListParagraph"/>
+        <w:rPr>
+          <w:sz w:val="28"/>
+          <w:szCs w:val="28"/>
+          <w:lang w:val="en-US"/>
+        </w:rPr>
+      </w:pPr>
+      <w:r>
+        <w:rPr>
+          <w:sz w:val="28"/>
+          <w:szCs w:val="28"/>
+          <w:lang w:val="en-US"/>
+        </w:rPr>
+        <w:t>SUCCESS JZ: Expected result (1) was received correctly</w:t>
+      </w:r>
+    </w:p>
+    <w:p>
+      <w:pPr>
+        <w:pStyle w:val="ListParagraph"/>
+        <w:rPr>
+          <w:sz w:val="28"/>
+          <w:szCs w:val="28"/>
+          <w:lang w:val="en-US"/>
+        </w:rPr>
+      </w:pPr>
+      <w:r>
+        <w:rPr>
+          <w:sz w:val="28"/>
+          <w:szCs w:val="28"/>
+          <w:lang w:val="en-US"/>
+        </w:rPr>
+        <w:t>SUCCESS ALU: Expected result (1) was received correctly</w:t>
       </w:r>
     </w:p>
     <w:p>
@@ -4003,7 +4553,7 @@
           <w:szCs w:val="28"/>
           <w:lang w:val="en-US"/>
         </w:rPr>
-        <w:t>SUCCESS: Expected instruction address was not changed  0</w:t>
+        <w:t>SUCCESS ALU: Expected result (0) was received correctly</w:t>
       </w:r>
     </w:p>
     <w:sectPr>
@@ -4245,6 +4795,119 @@
     </w:lvl>
   </w:abstractNum>
   <w:abstractNum w:abstractNumId="2" w15:restartNumberingAfterBreak="0">
+    <w:nsid w:val="25DF2779"/>
+    <w:multiLevelType w:val="hybridMultilevel"/>
+    <w:tmpl w:val="34286370"/>
+    <w:lvl w:ilvl="0" w:tplc="04190001">
+      <w:start w:val="1"/>
+      <w:numFmt w:val="bullet"/>
+      <w:lvlText w:val=""/>
+      <w:lvlJc w:val="left"/>
+      <w:pPr>
+        <w:ind w:left="1710" w:hanging="360"/>
+      </w:pPr>
+      <w:rPr>
+        <w:rFonts w:ascii="Symbol" w:hAnsi="Symbol" w:hint="default"/>
+      </w:rPr>
+    </w:lvl>
+    <w:lvl w:ilvl="1" w:tplc="04190003" w:tentative="1">
+      <w:start w:val="1"/>
+      <w:numFmt w:val="bullet"/>
+      <w:lvlText w:val="o"/>
+      <w:lvlJc w:val="left"/>
+      <w:pPr>
+        <w:ind w:left="2430" w:hanging="360"/>
+      </w:pPr>
+      <w:rPr>
+        <w:rFonts w:ascii="Courier New" w:hAnsi="Courier New" w:cs="Courier New" w:hint="default"/>
+      </w:rPr>
+    </w:lvl>
+    <w:lvl w:ilvl="2" w:tplc="04190005" w:tentative="1">
+      <w:start w:val="1"/>
+      <w:numFmt w:val="bullet"/>
+      <w:lvlText w:val=""/>
+      <w:lvlJc w:val="left"/>
+      <w:pPr>
+        <w:ind w:left="3150" w:hanging="360"/>
+      </w:pPr>
+      <w:rPr>
+        <w:rFonts w:ascii="Wingdings" w:hAnsi="Wingdings" w:hint="default"/>
+      </w:rPr>
+    </w:lvl>
+    <w:lvl w:ilvl="3" w:tplc="04190001" w:tentative="1">
+      <w:start w:val="1"/>
+      <w:numFmt w:val="bullet"/>
+      <w:lvlText w:val=""/>
+      <w:lvlJc w:val="left"/>
+      <w:pPr>
+        <w:ind w:left="3870" w:hanging="360"/>
+      </w:pPr>
+      <w:rPr>
+        <w:rFonts w:ascii="Symbol" w:hAnsi="Symbol" w:hint="default"/>
+      </w:rPr>
+    </w:lvl>
+    <w:lvl w:ilvl="4" w:tplc="04190003" w:tentative="1">
+      <w:start w:val="1"/>
+      <w:numFmt w:val="bullet"/>
+      <w:lvlText w:val="o"/>
+      <w:lvlJc w:val="left"/>
+      <w:pPr>
+        <w:ind w:left="4590" w:hanging="360"/>
+      </w:pPr>
+      <w:rPr>
+        <w:rFonts w:ascii="Courier New" w:hAnsi="Courier New" w:cs="Courier New" w:hint="default"/>
+      </w:rPr>
+    </w:lvl>
+    <w:lvl w:ilvl="5" w:tplc="04190005" w:tentative="1">
+      <w:start w:val="1"/>
+      <w:numFmt w:val="bullet"/>
+      <w:lvlText w:val=""/>
+      <w:lvlJc w:val="left"/>
+      <w:pPr>
+        <w:ind w:left="5310" w:hanging="360"/>
+      </w:pPr>
+      <w:rPr>
+        <w:rFonts w:ascii="Wingdings" w:hAnsi="Wingdings" w:hint="default"/>
+      </w:rPr>
+    </w:lvl>
+    <w:lvl w:ilvl="6" w:tplc="04190001" w:tentative="1">
+      <w:start w:val="1"/>
+      <w:numFmt w:val="bullet"/>
+      <w:lvlText w:val=""/>
+      <w:lvlJc w:val="left"/>
+      <w:pPr>
+        <w:ind w:left="6030" w:hanging="360"/>
+      </w:pPr>
+      <w:rPr>
+        <w:rFonts w:ascii="Symbol" w:hAnsi="Symbol" w:hint="default"/>
+      </w:rPr>
+    </w:lvl>
+    <w:lvl w:ilvl="7" w:tplc="04190003" w:tentative="1">
+      <w:start w:val="1"/>
+      <w:numFmt w:val="bullet"/>
+      <w:lvlText w:val="o"/>
+      <w:lvlJc w:val="left"/>
+      <w:pPr>
+        <w:ind w:left="6750" w:hanging="360"/>
+      </w:pPr>
+      <w:rPr>
+        <w:rFonts w:ascii="Courier New" w:hAnsi="Courier New" w:cs="Courier New" w:hint="default"/>
+      </w:rPr>
+    </w:lvl>
+    <w:lvl w:ilvl="8" w:tplc="04190005" w:tentative="1">
+      <w:start w:val="1"/>
+      <w:numFmt w:val="bullet"/>
+      <w:lvlText w:val=""/>
+      <w:lvlJc w:val="left"/>
+      <w:pPr>
+        <w:ind w:left="7470" w:hanging="360"/>
+      </w:pPr>
+      <w:rPr>
+        <w:rFonts w:ascii="Wingdings" w:hAnsi="Wingdings" w:hint="default"/>
+      </w:rPr>
+    </w:lvl>
+  </w:abstractNum>
+  <w:abstractNum w:abstractNumId="3" w15:restartNumberingAfterBreak="0">
     <w:nsid w:val="36EA648E"/>
     <w:multiLevelType w:val="hybridMultilevel"/>
     <w:tmpl w:val="23B2A4DE"/>
@@ -4335,7 +4998,7 @@
       </w:pPr>
     </w:lvl>
   </w:abstractNum>
-  <w:abstractNum w:abstractNumId="3" w15:restartNumberingAfterBreak="0">
+  <w:abstractNum w:abstractNumId="4" w15:restartNumberingAfterBreak="0">
     <w:nsid w:val="54AE61D4"/>
     <w:multiLevelType w:val="hybridMultilevel"/>
     <w:tmpl w:val="08CE380A"/>
@@ -4424,7 +5087,7 @@
       </w:pPr>
     </w:lvl>
   </w:abstractNum>
-  <w:abstractNum w:abstractNumId="4" w15:restartNumberingAfterBreak="0">
+  <w:abstractNum w:abstractNumId="5" w15:restartNumberingAfterBreak="0">
     <w:nsid w:val="62AA709A"/>
     <w:multiLevelType w:val="hybridMultilevel"/>
     <w:tmpl w:val="08CE380A"/>
@@ -4513,7 +5176,7 @@
       </w:pPr>
     </w:lvl>
   </w:abstractNum>
-  <w:abstractNum w:abstractNumId="5" w15:restartNumberingAfterBreak="0">
+  <w:abstractNum w:abstractNumId="6" w15:restartNumberingAfterBreak="0">
     <w:nsid w:val="7527249C"/>
     <w:multiLevelType w:val="multilevel"/>
     <w:tmpl w:val="370E800A"/>
@@ -4636,22 +5299,25 @@
     </w:lvl>
   </w:abstractNum>
   <w:num w:numId="1" w16cid:durableId="40709818">
-    <w:abstractNumId w:val="3"/>
+    <w:abstractNumId w:val="4"/>
   </w:num>
   <w:num w:numId="2" w16cid:durableId="1218853886">
+    <w:abstractNumId w:val="6"/>
+  </w:num>
+  <w:num w:numId="3" w16cid:durableId="287972990">
     <w:abstractNumId w:val="5"/>
   </w:num>
-  <w:num w:numId="3" w16cid:durableId="287972990">
-    <w:abstractNumId w:val="4"/>
-  </w:num>
   <w:num w:numId="4" w16cid:durableId="638534735">
-    <w:abstractNumId w:val="2"/>
+    <w:abstractNumId w:val="3"/>
   </w:num>
   <w:num w:numId="5" w16cid:durableId="315260609">
     <w:abstractNumId w:val="0"/>
   </w:num>
   <w:num w:numId="6" w16cid:durableId="508839466">
     <w:abstractNumId w:val="1"/>
+  </w:num>
+  <w:num w:numId="7" w16cid:durableId="117453143">
+    <w:abstractNumId w:val="2"/>
   </w:num>
 </w:numbering>
 </file>

</xml_diff>

<commit_message>
General rework + TOP module start
CPU_Package was created to keep flags structure.
There were some changes in ALU and other files.
Some fixes were made.
TOP_Unit has been started
</commit_message>
<xml_diff>
--- a/SystemVerilog_8-bit_CPU__Description.docx
+++ b/SystemVerilog_8-bit_CPU__Description.docx
@@ -13,7 +13,6 @@
           <w:lang w:val="en-US"/>
         </w:rPr>
       </w:pPr>
-      <w:proofErr w:type="spellStart"/>
       <w:r>
         <w:rPr>
           <w:b/>
@@ -42,18 +41,7 @@
           <w:szCs w:val="40"/>
           <w:lang w:val="en-US"/>
         </w:rPr>
-        <w:t>temVerilog</w:t>
-      </w:r>
-      <w:proofErr w:type="spellEnd"/>
-      <w:r>
-        <w:rPr>
-          <w:b/>
-          <w:bCs/>
-          <w:sz w:val="40"/>
-          <w:szCs w:val="40"/>
-          <w:lang w:val="en-US"/>
-        </w:rPr>
-        <w:t xml:space="preserve"> 8-bit CPU</w:t>
+        <w:t>temVerilog 8-bit CPU</w:t>
       </w:r>
     </w:p>
     <w:p>
@@ -250,29 +238,7 @@
           <w:szCs w:val="28"/>
           <w:lang w:val="en-US"/>
         </w:rPr>
-        <w:t>Hardware description (</w:t>
-      </w:r>
-      <w:proofErr w:type="spellStart"/>
-      <w:r>
-        <w:rPr>
-          <w:b/>
-          <w:bCs/>
-          <w:sz w:val="28"/>
-          <w:szCs w:val="28"/>
-          <w:lang w:val="en-US"/>
-        </w:rPr>
-        <w:t>SystemVerilog</w:t>
-      </w:r>
-      <w:proofErr w:type="spellEnd"/>
-      <w:r>
-        <w:rPr>
-          <w:b/>
-          <w:bCs/>
-          <w:sz w:val="28"/>
-          <w:szCs w:val="28"/>
-          <w:lang w:val="en-US"/>
-        </w:rPr>
-        <w:t xml:space="preserve"> &amp; Simulation)</w:t>
+        <w:t>Hardware description (SystemVerilog &amp; Simulation)</w:t>
       </w:r>
     </w:p>
     <w:p>
@@ -936,25 +902,7 @@
           <w:szCs w:val="28"/>
           <w:lang w:val="en-US"/>
         </w:rPr>
-        <w:t xml:space="preserve">The primary goal of this project is the design, </w:t>
-      </w:r>
-      <w:proofErr w:type="spellStart"/>
-      <w:r>
-        <w:rPr>
-          <w:sz w:val="28"/>
-          <w:szCs w:val="28"/>
-          <w:lang w:val="en-US"/>
-        </w:rPr>
-        <w:t>SystemVerilog</w:t>
-      </w:r>
-      <w:proofErr w:type="spellEnd"/>
-      <w:r>
-        <w:rPr>
-          <w:sz w:val="28"/>
-          <w:szCs w:val="28"/>
-          <w:lang w:val="en-US"/>
-        </w:rPr>
-        <w:t xml:space="preserve"> implementation, and functional verification of an 8-bit Central Processing Unit (CPU). Following the hardware realization, a custom software ecosystem</w:t>
+        <w:t>The primary goal of this project is the design, SystemVerilog implementation, and functional verification of an 8-bit Central Processing Unit (CPU). Following the hardware realization, a custom software ecosystem</w:t>
       </w:r>
       <w:r>
         <w:rPr>
@@ -1515,29 +1463,7 @@
           <w:lang w:val="en-US"/>
         </w:rPr>
         <w:lastRenderedPageBreak/>
-        <w:t>Hardware description (</w:t>
-      </w:r>
-      <w:proofErr w:type="spellStart"/>
-      <w:r>
-        <w:rPr>
-          <w:b/>
-          <w:bCs/>
-          <w:sz w:val="40"/>
-          <w:szCs w:val="40"/>
-          <w:lang w:val="en-US"/>
-        </w:rPr>
-        <w:t>SystemVerilog</w:t>
-      </w:r>
-      <w:proofErr w:type="spellEnd"/>
-      <w:r>
-        <w:rPr>
-          <w:b/>
-          <w:bCs/>
-          <w:sz w:val="40"/>
-          <w:szCs w:val="40"/>
-          <w:lang w:val="en-US"/>
-        </w:rPr>
-        <w:t xml:space="preserve"> &amp; Simulation)</w:t>
+        <w:t>Hardware description (SystemVerilog &amp; Simulation)</w:t>
       </w:r>
     </w:p>
     <w:p>
@@ -1655,41 +1581,13 @@
         </w:rPr>
         <w:br/>
       </w:r>
-      <w:proofErr w:type="spellStart"/>
-      <w:r>
-        <w:rPr>
-          <w:sz w:val="28"/>
-          <w:szCs w:val="28"/>
-          <w:lang w:val="en-US"/>
-        </w:rPr>
-        <w:t>ALU</w:t>
-      </w:r>
-      <w:proofErr w:type="spellEnd"/>
-      <w:r>
-        <w:rPr>
-          <w:sz w:val="28"/>
-          <w:szCs w:val="28"/>
-          <w:lang w:val="en-US"/>
-        </w:rPr>
-        <w:t xml:space="preserve"> module is mathematical and logical controller implementing such commands. This part of CPU is built asynchronously (there is no </w:t>
-      </w:r>
-      <w:proofErr w:type="spellStart"/>
-      <w:r>
-        <w:rPr>
-          <w:sz w:val="28"/>
-          <w:szCs w:val="28"/>
-          <w:lang w:val="en-US"/>
-        </w:rPr>
-        <w:t>clk</w:t>
-      </w:r>
-      <w:proofErr w:type="spellEnd"/>
-      <w:r>
-        <w:rPr>
-          <w:sz w:val="28"/>
-          <w:szCs w:val="28"/>
-          <w:lang w:val="en-US"/>
-        </w:rPr>
-        <w:t xml:space="preserve"> / reset </w:t>
+      <w:r>
+        <w:rPr>
+          <w:sz w:val="28"/>
+          <w:szCs w:val="28"/>
+          <w:lang w:val="en-US"/>
+        </w:rPr>
+        <w:t xml:space="preserve">ALU module is mathematical and logical controller implementing such commands. This part of CPU is built asynchronously (there is no clk / reset </w:t>
       </w:r>
       <w:r>
         <w:rPr>
@@ -2337,34 +2235,7 @@
           <w:szCs w:val="28"/>
           <w:lang w:val="en-US"/>
         </w:rPr>
-        <w:t xml:space="preserve">. Read / Write commands are realized in 2 different ways. Reading is executed asynchronously using “assign” operator allows get located data immediately, whereas writing depends on </w:t>
-      </w:r>
-      <w:proofErr w:type="spellStart"/>
-      <w:r>
-        <w:rPr>
-          <w:sz w:val="28"/>
-          <w:szCs w:val="28"/>
-          <w:lang w:val="en-US"/>
-        </w:rPr>
-        <w:t>clk</w:t>
-      </w:r>
-      <w:proofErr w:type="spellEnd"/>
-      <w:r>
-        <w:rPr>
-          <w:sz w:val="28"/>
-          <w:szCs w:val="28"/>
-          <w:lang w:val="en-US"/>
-        </w:rPr>
-        <w:t xml:space="preserve"> signal to avoid </w:t>
-      </w:r>
-      <w:proofErr w:type="spellStart"/>
-      <w:r>
-        <w:rPr>
-          <w:sz w:val="28"/>
-          <w:szCs w:val="28"/>
-          <w:lang w:val="en-US"/>
-        </w:rPr>
-        <w:t>ra</w:t>
+        <w:t>. Read / Write commands are realized in 2 different ways. Reading is executed asynchronously using “assign” operator allows get located data immediately, whereas writing depends on clk signal to avoid ra</w:t>
       </w:r>
       <w:r>
         <w:rPr>
@@ -2373,7 +2244,6 @@
         </w:rPr>
         <w:t>сы</w:t>
       </w:r>
-      <w:proofErr w:type="spellEnd"/>
       <w:r>
         <w:rPr>
           <w:sz w:val="28"/>
@@ -3102,10 +2972,10 @@
           <w:lang w:val="en-US"/>
         </w:rPr>
         <w:drawing>
-          <wp:inline distT="0" distB="0" distL="0" distR="0" wp14:anchorId="4EEF9E16" wp14:editId="7286819D">
-            <wp:extent cx="5940425" cy="1661795"/>
+          <wp:inline distT="0" distB="0" distL="0" distR="0" wp14:anchorId="63B4E8D1" wp14:editId="3AEEFC83">
+            <wp:extent cx="5940425" cy="1304290"/>
             <wp:effectExtent l="0" t="0" r="3175" b="0"/>
-            <wp:docPr id="8" name="Picture 8"/>
+            <wp:docPr id="3" name="Picture 3"/>
             <wp:cNvGraphicFramePr>
               <a:graphicFrameLocks xmlns:a="http://schemas.openxmlformats.org/drawingml/2006/main" noChangeAspect="1"/>
             </wp:cNvGraphicFramePr>
@@ -3125,7 +2995,7 @@
                   <pic:spPr>
                     <a:xfrm>
                       <a:off x="0" y="0"/>
-                      <a:ext cx="5940425" cy="1661795"/>
+                      <a:ext cx="5940425" cy="1304290"/>
                     </a:xfrm>
                     <a:prstGeom prst="rect">
                       <a:avLst/>
@@ -3344,7 +3214,6 @@
           <w:szCs w:val="28"/>
           <w:lang w:val="en-US"/>
         </w:rPr>
-        <w:lastRenderedPageBreak/>
         <w:t>SUCCESS: (+) Overflow was set</w:t>
       </w:r>
       <w:r>
@@ -3704,25 +3573,7 @@
           <w:szCs w:val="28"/>
           <w:lang w:val="en-US"/>
         </w:rPr>
-        <w:t xml:space="preserve">SUCCESS: </w:t>
-      </w:r>
-      <w:proofErr w:type="spellStart"/>
-      <w:r>
-        <w:rPr>
-          <w:sz w:val="28"/>
-          <w:szCs w:val="28"/>
-          <w:lang w:val="en-US"/>
-        </w:rPr>
-        <w:t>carry_out</w:t>
-      </w:r>
-      <w:proofErr w:type="spellEnd"/>
-      <w:r>
-        <w:rPr>
-          <w:sz w:val="28"/>
-          <w:szCs w:val="28"/>
-          <w:lang w:val="en-US"/>
-        </w:rPr>
-        <w:t xml:space="preserve"> flag was set correctly (1)</w:t>
+        <w:t>SUCCESS: carry_out flag was set correctly (1)</w:t>
       </w:r>
     </w:p>
     <w:p>
@@ -4009,43 +3860,43 @@
           <w:szCs w:val="28"/>
           <w:lang w:val="en-US"/>
         </w:rPr>
+        <w:t>SUCCESS: Expected data (  13) was written to the address cell   0</w:t>
+      </w:r>
+    </w:p>
+    <w:p>
+      <w:pPr>
+        <w:pStyle w:val="ListParagraph"/>
+        <w:rPr>
+          <w:sz w:val="28"/>
+          <w:szCs w:val="28"/>
+          <w:lang w:val="en-US"/>
+        </w:rPr>
+      </w:pPr>
+      <w:r>
+        <w:rPr>
+          <w:sz w:val="28"/>
+          <w:szCs w:val="28"/>
+          <w:lang w:val="en-US"/>
+        </w:rPr>
+        <w:t>SUCCESS: Expected data ( -64) was written to the address cell  17</w:t>
+      </w:r>
+    </w:p>
+    <w:p>
+      <w:pPr>
+        <w:pStyle w:val="ListParagraph"/>
+        <w:rPr>
+          <w:sz w:val="28"/>
+          <w:szCs w:val="28"/>
+          <w:lang w:val="en-US"/>
+        </w:rPr>
+      </w:pPr>
+      <w:r>
+        <w:rPr>
+          <w:sz w:val="28"/>
+          <w:szCs w:val="28"/>
+          <w:lang w:val="en-US"/>
+        </w:rPr>
         <w:lastRenderedPageBreak/>
-        <w:t>SUCCESS: Expected data (  13) was written to the address cell   0</w:t>
-      </w:r>
-    </w:p>
-    <w:p>
-      <w:pPr>
-        <w:pStyle w:val="ListParagraph"/>
-        <w:rPr>
-          <w:sz w:val="28"/>
-          <w:szCs w:val="28"/>
-          <w:lang w:val="en-US"/>
-        </w:rPr>
-      </w:pPr>
-      <w:r>
-        <w:rPr>
-          <w:sz w:val="28"/>
-          <w:szCs w:val="28"/>
-          <w:lang w:val="en-US"/>
-        </w:rPr>
-        <w:t>SUCCESS: Expected data ( -64) was written to the address cell  17</w:t>
-      </w:r>
-    </w:p>
-    <w:p>
-      <w:pPr>
-        <w:pStyle w:val="ListParagraph"/>
-        <w:rPr>
-          <w:sz w:val="28"/>
-          <w:szCs w:val="28"/>
-          <w:lang w:val="en-US"/>
-        </w:rPr>
-      </w:pPr>
-      <w:r>
-        <w:rPr>
-          <w:sz w:val="28"/>
-          <w:szCs w:val="28"/>
-          <w:lang w:val="en-US"/>
-        </w:rPr>
         <w:t>SUCCESS: Ad</w:t>
       </w:r>
       <w:r>

</xml_diff>

<commit_message>
ALU command bits distribution fix + TOP Unit tb skillet
ALU command bits distribution was fixed In the description file.
TOP Unit tb file base was added.
</commit_message>
<xml_diff>
--- a/SystemVerilog_8-bit_CPU__Description.docx
+++ b/SystemVerilog_8-bit_CPU__Description.docx
@@ -2152,9 +2152,8 @@
         <w:rPr>
           <w:sz w:val="28"/>
           <w:szCs w:val="28"/>
-          <w:lang w:val="en-US"/>
-        </w:rPr>
-        <w:t>–</w:t>
+        </w:rPr>
+        <w:t>-</w:t>
       </w:r>
       <w:r>
         <w:rPr>
@@ -2256,7 +2255,23 @@
           <w:szCs w:val="28"/>
           <w:lang w:val="en-US"/>
         </w:rPr>
-        <w:t>15:12 – Operation</w:t>
+        <w:t xml:space="preserve">15:12 </w:t>
+      </w:r>
+      <w:r>
+        <w:rPr>
+          <w:sz w:val="28"/>
+          <w:szCs w:val="28"/>
+          <w:lang w:val="en-US"/>
+        </w:rPr>
+        <w:t>-</w:t>
+      </w:r>
+      <w:r>
+        <w:rPr>
+          <w:sz w:val="28"/>
+          <w:szCs w:val="28"/>
+          <w:lang w:val="en-US"/>
+        </w:rPr>
+        <w:t xml:space="preserve"> Operation</w:t>
       </w:r>
       <w:r>
         <w:rPr>
@@ -2273,7 +2288,39 @@
           <w:lang w:val="en-US"/>
         </w:rPr>
         <w:tab/>
-        <w:t>11 – Register selection</w:t>
+        <w:t xml:space="preserve">11 </w:t>
+      </w:r>
+      <w:r>
+        <w:rPr>
+          <w:sz w:val="28"/>
+          <w:szCs w:val="28"/>
+          <w:lang w:val="en-US"/>
+        </w:rPr>
+        <w:t>-</w:t>
+      </w:r>
+      <w:r>
+        <w:rPr>
+          <w:sz w:val="28"/>
+          <w:szCs w:val="28"/>
+          <w:lang w:val="en-US"/>
+        </w:rPr>
+        <w:t xml:space="preserve"> </w:t>
+      </w:r>
+      <w:r>
+        <w:rPr>
+          <w:sz w:val="28"/>
+          <w:szCs w:val="28"/>
+          <w:lang w:val="en-US"/>
+        </w:rPr>
+        <w:t>Set result r</w:t>
+      </w:r>
+      <w:r>
+        <w:rPr>
+          <w:sz w:val="28"/>
+          <w:szCs w:val="28"/>
+          <w:lang w:val="en-US"/>
+        </w:rPr>
+        <w:t>egister selection</w:t>
       </w:r>
     </w:p>
     <w:p>
@@ -2293,7 +2340,36 @@
           <w:lang w:val="en-US"/>
         </w:rPr>
         <w:tab/>
-        <w:t>10:3 – Memory address</w:t>
+      </w:r>
+      <w:r>
+        <w:rPr>
+          <w:sz w:val="28"/>
+          <w:szCs w:val="28"/>
+        </w:rPr>
+        <w:t xml:space="preserve">10 </w:t>
+      </w:r>
+      <w:r>
+        <w:rPr>
+          <w:sz w:val="28"/>
+          <w:szCs w:val="28"/>
+          <w:lang w:val="en-US"/>
+        </w:rPr>
+        <w:t>-</w:t>
+      </w:r>
+      <w:r>
+        <w:rPr>
+          <w:sz w:val="28"/>
+          <w:szCs w:val="28"/>
+        </w:rPr>
+        <w:t xml:space="preserve"> </w:t>
+      </w:r>
+      <w:r>
+        <w:rPr>
+          <w:sz w:val="28"/>
+          <w:szCs w:val="28"/>
+          <w:lang w:val="en-US"/>
+        </w:rPr>
+        <w:t>Operand 1 (register)</w:t>
       </w:r>
     </w:p>
     <w:p>
@@ -2303,6 +2379,39 @@
         <w:rPr>
           <w:sz w:val="28"/>
           <w:szCs w:val="28"/>
+        </w:rPr>
+      </w:pPr>
+      <w:r>
+        <w:rPr>
+          <w:sz w:val="28"/>
+          <w:szCs w:val="28"/>
+          <w:lang w:val="en-US"/>
+        </w:rPr>
+        <w:t xml:space="preserve"> </w:t>
+      </w:r>
+      <w:r>
+        <w:rPr>
+          <w:sz w:val="28"/>
+          <w:szCs w:val="28"/>
+        </w:rPr>
+        <w:t xml:space="preserve"> 9</w:t>
+      </w:r>
+      <w:r>
+        <w:rPr>
+          <w:sz w:val="28"/>
+          <w:szCs w:val="28"/>
+          <w:lang w:val="en-US"/>
+        </w:rPr>
+        <w:t xml:space="preserve"> - Operand 2 (register)</w:t>
+      </w:r>
+    </w:p>
+    <w:p>
+      <w:pPr>
+        <w:pStyle w:val="ListParagraph"/>
+        <w:ind w:left="634"/>
+        <w:rPr>
+          <w:sz w:val="28"/>
+          <w:szCs w:val="28"/>
           <w:lang w:val="en-US"/>
         </w:rPr>
       </w:pPr>
@@ -2313,7 +2422,37 @@
           <w:lang w:val="en-US"/>
         </w:rPr>
         <w:tab/>
-        <w:t>2:0 - Reserved</w:t>
+      </w:r>
+      <w:r>
+        <w:rPr>
+          <w:sz w:val="28"/>
+          <w:szCs w:val="28"/>
+        </w:rPr>
+        <w:t>8</w:t>
+      </w:r>
+      <w:r>
+        <w:rPr>
+          <w:sz w:val="28"/>
+          <w:szCs w:val="28"/>
+          <w:lang w:val="en-US"/>
+        </w:rPr>
+        <w:t xml:space="preserve">:0 </w:t>
+      </w:r>
+      <w:r>
+        <w:rPr>
+          <w:sz w:val="28"/>
+          <w:szCs w:val="28"/>
+          <w:lang w:val="en-US"/>
+        </w:rPr>
+        <w:t>-</w:t>
+      </w:r>
+      <w:r>
+        <w:rPr>
+          <w:sz w:val="28"/>
+          <w:szCs w:val="28"/>
+          <w:lang w:val="en-US"/>
+        </w:rPr>
+        <w:t xml:space="preserve"> Reserved</w:t>
       </w:r>
     </w:p>
     <w:p>
@@ -2411,7 +2550,7 @@
           <w:szCs w:val="28"/>
           <w:lang w:val="en-US"/>
         </w:rPr>
-        <w:t xml:space="preserve">. Read / Write commands are realized in 2 different ways. Reading is executed asynchronously using “assign” operator allows get located </w:t>
+        <w:t xml:space="preserve">. Read / Write commands are realized in 2 different ways. Reading is </w:t>
       </w:r>
       <w:r>
         <w:rPr>
@@ -2420,7 +2559,7 @@
           <w:lang w:val="en-US"/>
         </w:rPr>
         <w:lastRenderedPageBreak/>
-        <w:t>data immediately, whereas writing depends on clk signal to avoid ra</w:t>
+        <w:t>executed asynchronously using “assign” operator allows get located data immediately, whereas writing depends on clk signal to avoid ra</w:t>
       </w:r>
       <w:r>
         <w:rPr>
@@ -2898,6 +3037,7 @@
           <w:szCs w:val="28"/>
           <w:lang w:val="en-US"/>
         </w:rPr>
+        <w:lastRenderedPageBreak/>
         <w:t>STORE (Load value from register in data memory) 0100</w:t>
       </w:r>
     </w:p>
@@ -2924,7 +3064,6 @@
           <w:szCs w:val="28"/>
           <w:lang w:val="en-US"/>
         </w:rPr>
-        <w:lastRenderedPageBreak/>
         <w:t>JMP (Move to concrete address) 0010</w:t>
       </w:r>
     </w:p>
@@ -2987,17 +3126,7 @@
           <w:szCs w:val="28"/>
           <w:lang w:val="en-US"/>
         </w:rPr>
-        <w:t xml:space="preserve">   </w:t>
-      </w:r>
-      <w:r>
-        <w:rPr>
-          <w:b/>
-          <w:bCs/>
-          <w:sz w:val="28"/>
-          <w:szCs w:val="28"/>
-          <w:lang w:val="en-US"/>
-        </w:rPr>
-        <w:t>Bits Distribution [15-0] (LOADI):</w:t>
+        <w:t xml:space="preserve">   Bits Distribution [15-0] (LOADI):</w:t>
       </w:r>
     </w:p>
     <w:p>
@@ -3029,15 +3158,6 @@
           <w:lang w:val="en-US"/>
         </w:rPr>
         <w:tab/>
-      </w:r>
-      <w:r>
-        <w:rPr>
-          <w:b/>
-          <w:bCs/>
-          <w:sz w:val="28"/>
-          <w:szCs w:val="28"/>
-          <w:lang w:val="en-US"/>
-        </w:rPr>
         <w:t xml:space="preserve">  </w:t>
       </w:r>
       <w:r>
@@ -3046,7 +3166,22 @@
           <w:szCs w:val="28"/>
           <w:lang w:val="en-US"/>
         </w:rPr>
-        <w:t>15:12 – Operation</w:t>
+        <w:t xml:space="preserve">15:12 </w:t>
+      </w:r>
+      <w:r>
+        <w:rPr>
+          <w:sz w:val="28"/>
+          <w:szCs w:val="28"/>
+        </w:rPr>
+        <w:t>-</w:t>
+      </w:r>
+      <w:r>
+        <w:rPr>
+          <w:sz w:val="28"/>
+          <w:szCs w:val="28"/>
+          <w:lang w:val="en-US"/>
+        </w:rPr>
+        <w:t xml:space="preserve"> Operation</w:t>
       </w:r>
       <w:r>
         <w:rPr>
@@ -3078,7 +3213,22 @@
           <w:szCs w:val="28"/>
           <w:lang w:val="en-US"/>
         </w:rPr>
-        <w:t>11 – Register selection</w:t>
+        <w:t>11</w:t>
+      </w:r>
+      <w:r>
+        <w:rPr>
+          <w:sz w:val="28"/>
+          <w:szCs w:val="28"/>
+        </w:rPr>
+        <w:t xml:space="preserve"> -</w:t>
+      </w:r>
+      <w:r>
+        <w:rPr>
+          <w:sz w:val="28"/>
+          <w:szCs w:val="28"/>
+          <w:lang w:val="en-US"/>
+        </w:rPr>
+        <w:t xml:space="preserve"> Register selection</w:t>
       </w:r>
     </w:p>
     <w:p>
@@ -3113,7 +3263,22 @@
           <w:szCs w:val="28"/>
           <w:lang w:val="en-US"/>
         </w:rPr>
-        <w:t xml:space="preserve">10:3 – </w:t>
+        <w:t xml:space="preserve">10:3 </w:t>
+      </w:r>
+      <w:r>
+        <w:rPr>
+          <w:sz w:val="28"/>
+          <w:szCs w:val="28"/>
+        </w:rPr>
+        <w:t>-</w:t>
+      </w:r>
+      <w:r>
+        <w:rPr>
+          <w:sz w:val="28"/>
+          <w:szCs w:val="28"/>
+          <w:lang w:val="en-US"/>
+        </w:rPr>
+        <w:t xml:space="preserve"> </w:t>
       </w:r>
       <w:r>
         <w:rPr>
@@ -3193,7 +3358,19 @@
           <w:lang w:val="en-US"/>
         </w:rPr>
         <w:tab/>
-      </w:r>
+        <w:t xml:space="preserve"> Bits Distribution [15-0] (LOAD, STORE):</w:t>
+      </w:r>
+    </w:p>
+    <w:p>
+      <w:pPr>
+        <w:pStyle w:val="ListParagraph"/>
+        <w:ind w:left="634"/>
+        <w:rPr>
+          <w:sz w:val="28"/>
+          <w:szCs w:val="28"/>
+          <w:lang w:val="en-US"/>
+        </w:rPr>
+      </w:pPr>
       <w:r>
         <w:rPr>
           <w:b/>
@@ -3212,28 +3389,370 @@
           <w:szCs w:val="28"/>
           <w:lang w:val="en-US"/>
         </w:rPr>
-        <w:t>Bits Distribution [15-0]</w:t>
-      </w:r>
-      <w:r>
-        <w:rPr>
-          <w:b/>
-          <w:bCs/>
-          <w:sz w:val="28"/>
-          <w:szCs w:val="28"/>
-          <w:lang w:val="en-US"/>
-        </w:rPr>
-        <w:t xml:space="preserve"> (LOAD, STORE)</w:t>
-      </w:r>
-      <w:r>
-        <w:rPr>
-          <w:b/>
-          <w:bCs/>
+        <w:tab/>
+        <w:t xml:space="preserve"> </w:t>
+      </w:r>
+      <w:r>
+        <w:rPr>
+          <w:sz w:val="28"/>
+          <w:szCs w:val="28"/>
+          <w:lang w:val="en-US"/>
+        </w:rPr>
+        <w:t xml:space="preserve">15:12 </w:t>
+      </w:r>
+      <w:r>
+        <w:rPr>
+          <w:sz w:val="28"/>
+          <w:szCs w:val="28"/>
+          <w:lang w:val="en-US"/>
+        </w:rPr>
+        <w:t>-</w:t>
+      </w:r>
+      <w:r>
+        <w:rPr>
+          <w:sz w:val="28"/>
+          <w:szCs w:val="28"/>
+          <w:lang w:val="en-US"/>
+        </w:rPr>
+        <w:t>Operation</w:t>
+      </w:r>
+      <w:r>
+        <w:rPr>
+          <w:sz w:val="28"/>
+          <w:szCs w:val="28"/>
+          <w:lang w:val="en-US"/>
+        </w:rPr>
+        <w:br/>
+      </w:r>
+      <w:r>
+        <w:rPr>
+          <w:sz w:val="28"/>
+          <w:szCs w:val="28"/>
+          <w:lang w:val="en-US"/>
+        </w:rPr>
+        <w:tab/>
+      </w:r>
+      <w:r>
+        <w:rPr>
+          <w:sz w:val="28"/>
+          <w:szCs w:val="28"/>
+          <w:lang w:val="en-US"/>
+        </w:rPr>
+        <w:t xml:space="preserve"> </w:t>
+      </w:r>
+      <w:r>
+        <w:rPr>
+          <w:sz w:val="28"/>
+          <w:szCs w:val="28"/>
+          <w:lang w:val="en-US"/>
+        </w:rPr>
+        <w:t>11</w:t>
+      </w:r>
+      <w:r>
+        <w:rPr>
+          <w:sz w:val="28"/>
+          <w:szCs w:val="28"/>
+          <w:lang w:val="en-US"/>
+        </w:rPr>
+        <w:t>-</w:t>
+      </w:r>
+      <w:r>
+        <w:rPr>
+          <w:sz w:val="28"/>
+          <w:szCs w:val="28"/>
+        </w:rPr>
+        <w:t xml:space="preserve"> </w:t>
+      </w:r>
+      <w:r>
+        <w:rPr>
+          <w:sz w:val="28"/>
+          <w:szCs w:val="28"/>
+          <w:lang w:val="en-US"/>
+        </w:rPr>
+        <w:t>Register selection</w:t>
+      </w:r>
+    </w:p>
+    <w:p>
+      <w:pPr>
+        <w:pStyle w:val="ListParagraph"/>
+        <w:ind w:left="634"/>
+        <w:rPr>
+          <w:sz w:val="28"/>
+          <w:szCs w:val="28"/>
+          <w:lang w:val="en-US"/>
+        </w:rPr>
+      </w:pPr>
+      <w:r>
+        <w:rPr>
+          <w:sz w:val="28"/>
+          <w:szCs w:val="28"/>
+          <w:lang w:val="en-US"/>
+        </w:rPr>
+        <w:tab/>
+      </w:r>
+      <w:r>
+        <w:rPr>
+          <w:sz w:val="28"/>
+          <w:szCs w:val="28"/>
+          <w:lang w:val="en-US"/>
+        </w:rPr>
+        <w:t xml:space="preserve"> </w:t>
+      </w:r>
+      <w:r>
+        <w:rPr>
+          <w:sz w:val="28"/>
+          <w:szCs w:val="28"/>
+          <w:lang w:val="en-US"/>
+        </w:rPr>
+        <w:t>10:3</w:t>
+      </w:r>
+      <w:r>
+        <w:rPr>
+          <w:sz w:val="28"/>
+          <w:szCs w:val="28"/>
+          <w:lang w:val="en-US"/>
+        </w:rPr>
+        <w:t xml:space="preserve"> -</w:t>
+      </w:r>
+      <w:r>
+        <w:rPr>
+          <w:sz w:val="28"/>
+          <w:szCs w:val="28"/>
+          <w:lang w:val="en-US"/>
+        </w:rPr>
+        <w:t xml:space="preserve"> Memory address</w:t>
+      </w:r>
+    </w:p>
+    <w:p>
+      <w:pPr>
+        <w:pStyle w:val="ListParagraph"/>
+        <w:ind w:left="634"/>
+        <w:rPr>
+          <w:sz w:val="28"/>
+          <w:szCs w:val="28"/>
+          <w:lang w:val="en-US"/>
+        </w:rPr>
+      </w:pPr>
+      <w:r>
+        <w:rPr>
+          <w:sz w:val="28"/>
+          <w:szCs w:val="28"/>
+          <w:lang w:val="en-US"/>
+        </w:rPr>
+        <w:tab/>
+      </w:r>
+      <w:r>
+        <w:rPr>
+          <w:sz w:val="28"/>
+          <w:szCs w:val="28"/>
+          <w:lang w:val="en-US"/>
+        </w:rPr>
+        <w:t xml:space="preserve"> </w:t>
+      </w:r>
+      <w:r>
+        <w:rPr>
+          <w:sz w:val="28"/>
+          <w:szCs w:val="28"/>
+          <w:lang w:val="en-US"/>
+        </w:rPr>
+        <w:t xml:space="preserve">2:0 </w:t>
+      </w:r>
+      <w:r>
+        <w:rPr>
+          <w:sz w:val="28"/>
+          <w:szCs w:val="28"/>
+        </w:rPr>
+        <w:t>-</w:t>
+      </w:r>
+      <w:r>
+        <w:rPr>
+          <w:sz w:val="28"/>
+          <w:szCs w:val="28"/>
+          <w:lang w:val="en-US"/>
+        </w:rPr>
+        <w:t xml:space="preserve"> Reserved</w:t>
+      </w:r>
+    </w:p>
+    <w:p>
+      <w:pPr>
+        <w:pStyle w:val="ListParagraph"/>
+        <w:ind w:left="634"/>
+        <w:rPr>
+          <w:sz w:val="28"/>
+          <w:szCs w:val="28"/>
+          <w:lang w:val="en-US"/>
+        </w:rPr>
+      </w:pPr>
+    </w:p>
+    <w:p>
+      <w:pPr>
+        <w:pStyle w:val="ListParagraph"/>
+        <w:ind w:left="634"/>
+        <w:rPr>
+          <w:b/>
+          <w:bCs/>
+          <w:sz w:val="28"/>
+          <w:szCs w:val="28"/>
+          <w:lang w:val="en-US"/>
+        </w:rPr>
+      </w:pPr>
+      <w:r>
+        <w:rPr>
+          <w:b/>
+          <w:bCs/>
+          <w:sz w:val="28"/>
+          <w:szCs w:val="28"/>
+          <w:lang w:val="en-US"/>
+        </w:rPr>
+        <w:t>Bits Distribution [15-0] (JMP,):</w:t>
+      </w:r>
+    </w:p>
+    <w:p>
+      <w:pPr>
+        <w:pStyle w:val="ListParagraph"/>
+        <w:ind w:left="634"/>
+        <w:rPr>
+          <w:sz w:val="28"/>
+          <w:szCs w:val="28"/>
+          <w:lang w:val="en-US"/>
+        </w:rPr>
+      </w:pPr>
+      <w:r>
+        <w:rPr>
+          <w:b/>
+          <w:bCs/>
+          <w:sz w:val="28"/>
+          <w:szCs w:val="28"/>
+          <w:lang w:val="en-US"/>
+        </w:rPr>
+        <w:t xml:space="preserve"> </w:t>
+      </w:r>
+      <w:r>
+        <w:rPr>
+          <w:b/>
+          <w:bCs/>
+          <w:sz w:val="28"/>
+          <w:szCs w:val="28"/>
+          <w:lang w:val="en-US"/>
+        </w:rPr>
+        <w:tab/>
+      </w:r>
+      <w:r>
+        <w:rPr>
+          <w:sz w:val="28"/>
+          <w:szCs w:val="28"/>
+          <w:lang w:val="en-US"/>
+        </w:rPr>
+        <w:t xml:space="preserve">15:12 </w:t>
+      </w:r>
+      <w:r>
+        <w:rPr>
+          <w:sz w:val="28"/>
+          <w:szCs w:val="28"/>
+        </w:rPr>
+        <w:t>-</w:t>
+      </w:r>
+      <w:r>
+        <w:rPr>
+          <w:sz w:val="28"/>
+          <w:szCs w:val="28"/>
+          <w:lang w:val="en-US"/>
+        </w:rPr>
+        <w:t xml:space="preserve"> Operation</w:t>
+      </w:r>
+    </w:p>
+    <w:p>
+      <w:pPr>
+        <w:pStyle w:val="ListParagraph"/>
+        <w:ind w:left="634"/>
+        <w:rPr>
+          <w:sz w:val="28"/>
+          <w:szCs w:val="28"/>
+          <w:lang w:val="en-US"/>
+        </w:rPr>
+      </w:pPr>
+      <w:r>
+        <w:rPr>
+          <w:sz w:val="28"/>
+          <w:szCs w:val="28"/>
+          <w:lang w:val="en-US"/>
+        </w:rPr>
+        <w:t xml:space="preserve"> 11 - Reserved</w:t>
+      </w:r>
+    </w:p>
+    <w:p>
+      <w:pPr>
+        <w:pStyle w:val="ListParagraph"/>
+        <w:ind w:left="634"/>
+        <w:rPr>
+          <w:sz w:val="28"/>
+          <w:szCs w:val="28"/>
+          <w:lang w:val="en-US"/>
+        </w:rPr>
+      </w:pPr>
+      <w:r>
+        <w:rPr>
+          <w:sz w:val="28"/>
+          <w:szCs w:val="28"/>
+          <w:lang w:val="en-US"/>
+        </w:rPr>
+        <w:t xml:space="preserve"> </w:t>
+      </w:r>
+      <w:r>
+        <w:rPr>
+          <w:sz w:val="28"/>
+          <w:szCs w:val="28"/>
+          <w:lang w:val="en-US"/>
+        </w:rPr>
+        <w:t>1</w:t>
+      </w:r>
+      <w:r>
+        <w:rPr>
+          <w:sz w:val="28"/>
+          <w:szCs w:val="28"/>
+          <w:lang w:val="en-US"/>
+        </w:rPr>
+        <w:t>0</w:t>
+      </w:r>
+      <w:r>
+        <w:rPr>
           <w:sz w:val="28"/>
           <w:szCs w:val="28"/>
           <w:lang w:val="en-US"/>
         </w:rPr>
         <w:t>:</w:t>
       </w:r>
+      <w:r>
+        <w:rPr>
+          <w:sz w:val="28"/>
+          <w:szCs w:val="28"/>
+          <w:lang w:val="en-US"/>
+        </w:rPr>
+        <w:t xml:space="preserve">3 </w:t>
+      </w:r>
+      <w:r>
+        <w:rPr>
+          <w:sz w:val="28"/>
+          <w:szCs w:val="28"/>
+        </w:rPr>
+        <w:t>-</w:t>
+      </w:r>
+      <w:r>
+        <w:rPr>
+          <w:sz w:val="28"/>
+          <w:szCs w:val="28"/>
+          <w:lang w:val="en-US"/>
+        </w:rPr>
+        <w:t xml:space="preserve"> </w:t>
+      </w:r>
+      <w:r>
+        <w:rPr>
+          <w:sz w:val="28"/>
+          <w:szCs w:val="28"/>
+          <w:lang w:val="en-US"/>
+        </w:rPr>
+        <w:t>Address</w:t>
+      </w:r>
     </w:p>
     <w:p>
       <w:pPr>
@@ -3247,6 +3766,75 @@
       </w:pPr>
       <w:r>
         <w:rPr>
+          <w:sz w:val="28"/>
+          <w:szCs w:val="28"/>
+          <w:lang w:val="en-US"/>
+        </w:rPr>
+        <w:tab/>
+      </w:r>
+      <w:r>
+        <w:rPr>
+          <w:sz w:val="28"/>
+          <w:szCs w:val="28"/>
+          <w:lang w:val="en-US"/>
+        </w:rPr>
+        <w:t>2</w:t>
+      </w:r>
+      <w:r>
+        <w:rPr>
+          <w:sz w:val="28"/>
+          <w:szCs w:val="28"/>
+          <w:lang w:val="en-US"/>
+        </w:rPr>
+        <w:t>:0 - Reserved</w:t>
+      </w:r>
+    </w:p>
+    <w:p>
+      <w:pPr>
+        <w:pStyle w:val="ListParagraph"/>
+        <w:ind w:left="634"/>
+        <w:rPr>
+          <w:sz w:val="28"/>
+          <w:szCs w:val="28"/>
+          <w:lang w:val="en-US"/>
+        </w:rPr>
+      </w:pPr>
+    </w:p>
+    <w:p>
+      <w:pPr>
+        <w:pStyle w:val="ListParagraph"/>
+        <w:ind w:left="634"/>
+        <w:rPr>
+          <w:b/>
+          <w:bCs/>
+          <w:sz w:val="28"/>
+          <w:szCs w:val="28"/>
+          <w:lang w:val="en-US"/>
+        </w:rPr>
+      </w:pPr>
+      <w:r>
+        <w:rPr>
+          <w:b/>
+          <w:bCs/>
+          <w:sz w:val="28"/>
+          <w:szCs w:val="28"/>
+          <w:lang w:val="en-US"/>
+        </w:rPr>
+        <w:t>Bits Distribution [15-0] (JZ):</w:t>
+      </w:r>
+    </w:p>
+    <w:p>
+      <w:pPr>
+        <w:pStyle w:val="ListParagraph"/>
+        <w:ind w:left="634"/>
+        <w:rPr>
+          <w:sz w:val="28"/>
+          <w:szCs w:val="28"/>
+          <w:lang w:val="en-US"/>
+        </w:rPr>
+      </w:pPr>
+      <w:r>
+        <w:rPr>
           <w:b/>
           <w:bCs/>
           <w:sz w:val="28"/>
@@ -3267,8 +3855,53 @@
       </w:r>
       <w:r>
         <w:rPr>
-          <w:b/>
-          <w:bCs/>
+          <w:sz w:val="28"/>
+          <w:szCs w:val="28"/>
+          <w:lang w:val="en-US"/>
+        </w:rPr>
+        <w:t xml:space="preserve">15:12 </w:t>
+      </w:r>
+      <w:r>
+        <w:rPr>
+          <w:sz w:val="28"/>
+          <w:szCs w:val="28"/>
+        </w:rPr>
+        <w:t>-</w:t>
+      </w:r>
+      <w:r>
+        <w:rPr>
+          <w:sz w:val="28"/>
+          <w:szCs w:val="28"/>
+          <w:lang w:val="en-US"/>
+        </w:rPr>
+        <w:t xml:space="preserve"> Operation</w:t>
+      </w:r>
+      <w:r>
+        <w:rPr>
+          <w:sz w:val="28"/>
+          <w:szCs w:val="28"/>
+          <w:lang w:val="en-US"/>
+        </w:rPr>
+        <w:br/>
+      </w:r>
+      <w:r>
+        <w:rPr>
+          <w:sz w:val="28"/>
+          <w:szCs w:val="28"/>
+          <w:lang w:val="en-US"/>
+        </w:rPr>
+        <w:tab/>
+        <w:t xml:space="preserve">11 </w:t>
+      </w:r>
+      <w:r>
+        <w:rPr>
+          <w:sz w:val="28"/>
+          <w:szCs w:val="28"/>
+        </w:rPr>
+        <w:t>-</w:t>
+      </w:r>
+      <w:r>
+        <w:rPr>
           <w:sz w:val="28"/>
           <w:szCs w:val="28"/>
           <w:lang w:val="en-US"/>
@@ -3281,16 +3914,19 @@
           <w:szCs w:val="28"/>
           <w:lang w:val="en-US"/>
         </w:rPr>
-        <w:t>15:12 – Operation</w:t>
-      </w:r>
-      <w:r>
-        <w:rPr>
-          <w:sz w:val="28"/>
-          <w:szCs w:val="28"/>
-          <w:lang w:val="en-US"/>
-        </w:rPr>
-        <w:br/>
-      </w:r>
+        <w:t>Flag</w:t>
+      </w:r>
+    </w:p>
+    <w:p>
+      <w:pPr>
+        <w:pStyle w:val="ListParagraph"/>
+        <w:ind w:left="634"/>
+        <w:rPr>
+          <w:sz w:val="28"/>
+          <w:szCs w:val="28"/>
+          <w:lang w:val="en-US"/>
+        </w:rPr>
+      </w:pPr>
       <w:r>
         <w:rPr>
           <w:sz w:val="28"/>
@@ -3298,6 +3934,14 @@
           <w:lang w:val="en-US"/>
         </w:rPr>
         <w:tab/>
+        <w:t xml:space="preserve">10:3 </w:t>
+      </w:r>
+      <w:r>
+        <w:rPr>
+          <w:sz w:val="28"/>
+          <w:szCs w:val="28"/>
+        </w:rPr>
+        <w:t>-</w:t>
       </w:r>
       <w:r>
         <w:rPr>
@@ -3306,432 +3950,6 @@
           <w:lang w:val="en-US"/>
         </w:rPr>
         <w:t xml:space="preserve"> </w:t>
-      </w:r>
-      <w:r>
-        <w:rPr>
-          <w:sz w:val="28"/>
-          <w:szCs w:val="28"/>
-          <w:lang w:val="en-US"/>
-        </w:rPr>
-        <w:t>11 – Register selection</w:t>
-      </w:r>
-    </w:p>
-    <w:p>
-      <w:pPr>
-        <w:pStyle w:val="ListParagraph"/>
-        <w:ind w:left="634"/>
-        <w:rPr>
-          <w:sz w:val="28"/>
-          <w:szCs w:val="28"/>
-          <w:lang w:val="en-US"/>
-        </w:rPr>
-      </w:pPr>
-      <w:r>
-        <w:rPr>
-          <w:sz w:val="28"/>
-          <w:szCs w:val="28"/>
-          <w:lang w:val="en-US"/>
-        </w:rPr>
-        <w:tab/>
-      </w:r>
-      <w:r>
-        <w:rPr>
-          <w:sz w:val="28"/>
-          <w:szCs w:val="28"/>
-          <w:lang w:val="en-US"/>
-        </w:rPr>
-        <w:t xml:space="preserve"> </w:t>
-      </w:r>
-      <w:r>
-        <w:rPr>
-          <w:sz w:val="28"/>
-          <w:szCs w:val="28"/>
-          <w:lang w:val="en-US"/>
-        </w:rPr>
-        <w:t>10:3 – Memory address</w:t>
-      </w:r>
-    </w:p>
-    <w:p>
-      <w:pPr>
-        <w:pStyle w:val="ListParagraph"/>
-        <w:ind w:left="634"/>
-        <w:rPr>
-          <w:sz w:val="28"/>
-          <w:szCs w:val="28"/>
-          <w:lang w:val="en-US"/>
-        </w:rPr>
-      </w:pPr>
-      <w:r>
-        <w:rPr>
-          <w:sz w:val="28"/>
-          <w:szCs w:val="28"/>
-          <w:lang w:val="en-US"/>
-        </w:rPr>
-        <w:tab/>
-      </w:r>
-      <w:r>
-        <w:rPr>
-          <w:sz w:val="28"/>
-          <w:szCs w:val="28"/>
-          <w:lang w:val="en-US"/>
-        </w:rPr>
-        <w:t xml:space="preserve"> </w:t>
-      </w:r>
-      <w:r>
-        <w:rPr>
-          <w:sz w:val="28"/>
-          <w:szCs w:val="28"/>
-          <w:lang w:val="en-US"/>
-        </w:rPr>
-        <w:t xml:space="preserve">2:0 </w:t>
-      </w:r>
-      <w:r>
-        <w:rPr>
-          <w:sz w:val="28"/>
-          <w:szCs w:val="28"/>
-          <w:lang w:val="en-US"/>
-        </w:rPr>
-        <w:t>–</w:t>
-      </w:r>
-      <w:r>
-        <w:rPr>
-          <w:sz w:val="28"/>
-          <w:szCs w:val="28"/>
-          <w:lang w:val="en-US"/>
-        </w:rPr>
-        <w:t xml:space="preserve"> Reserved</w:t>
-      </w:r>
-    </w:p>
-    <w:p>
-      <w:pPr>
-        <w:pStyle w:val="ListParagraph"/>
-        <w:ind w:left="634"/>
-        <w:rPr>
-          <w:sz w:val="28"/>
-          <w:szCs w:val="28"/>
-          <w:lang w:val="en-US"/>
-        </w:rPr>
-      </w:pPr>
-    </w:p>
-    <w:p>
-      <w:pPr>
-        <w:pStyle w:val="ListParagraph"/>
-        <w:ind w:left="634"/>
-        <w:rPr>
-          <w:b/>
-          <w:bCs/>
-          <w:sz w:val="28"/>
-          <w:szCs w:val="28"/>
-          <w:lang w:val="en-US"/>
-        </w:rPr>
-      </w:pPr>
-      <w:r>
-        <w:rPr>
-          <w:b/>
-          <w:bCs/>
-          <w:sz w:val="28"/>
-          <w:szCs w:val="28"/>
-          <w:lang w:val="en-US"/>
-        </w:rPr>
-        <w:t>Bits Distribution [15-0] (JMP,):</w:t>
-      </w:r>
-    </w:p>
-    <w:p>
-      <w:pPr>
-        <w:pStyle w:val="ListParagraph"/>
-        <w:ind w:left="634"/>
-        <w:rPr>
-          <w:sz w:val="28"/>
-          <w:szCs w:val="28"/>
-          <w:lang w:val="en-US"/>
-        </w:rPr>
-      </w:pPr>
-      <w:r>
-        <w:rPr>
-          <w:b/>
-          <w:bCs/>
-          <w:sz w:val="28"/>
-          <w:szCs w:val="28"/>
-          <w:lang w:val="en-US"/>
-        </w:rPr>
-        <w:t xml:space="preserve"> </w:t>
-      </w:r>
-      <w:r>
-        <w:rPr>
-          <w:b/>
-          <w:bCs/>
-          <w:sz w:val="28"/>
-          <w:szCs w:val="28"/>
-          <w:lang w:val="en-US"/>
-        </w:rPr>
-        <w:tab/>
-      </w:r>
-      <w:r>
-        <w:rPr>
-          <w:sz w:val="28"/>
-          <w:szCs w:val="28"/>
-          <w:lang w:val="en-US"/>
-        </w:rPr>
-        <w:t>15:12 – Operation</w:t>
-      </w:r>
-    </w:p>
-    <w:p>
-      <w:pPr>
-        <w:pStyle w:val="ListParagraph"/>
-        <w:ind w:left="634"/>
-        <w:rPr>
-          <w:sz w:val="28"/>
-          <w:szCs w:val="28"/>
-          <w:lang w:val="en-US"/>
-        </w:rPr>
-      </w:pPr>
-      <w:r>
-        <w:rPr>
-          <w:sz w:val="28"/>
-          <w:szCs w:val="28"/>
-          <w:lang w:val="en-US"/>
-        </w:rPr>
-        <w:t xml:space="preserve"> 11 - Reserved</w:t>
-      </w:r>
-    </w:p>
-    <w:p>
-      <w:pPr>
-        <w:pStyle w:val="ListParagraph"/>
-        <w:ind w:left="634"/>
-        <w:rPr>
-          <w:sz w:val="28"/>
-          <w:szCs w:val="28"/>
-          <w:lang w:val="en-US"/>
-        </w:rPr>
-      </w:pPr>
-      <w:r>
-        <w:rPr>
-          <w:sz w:val="28"/>
-          <w:szCs w:val="28"/>
-          <w:lang w:val="en-US"/>
-        </w:rPr>
-        <w:t xml:space="preserve"> </w:t>
-      </w:r>
-      <w:r>
-        <w:rPr>
-          <w:sz w:val="28"/>
-          <w:szCs w:val="28"/>
-          <w:lang w:val="en-US"/>
-        </w:rPr>
-        <w:t>1</w:t>
-      </w:r>
-      <w:r>
-        <w:rPr>
-          <w:sz w:val="28"/>
-          <w:szCs w:val="28"/>
-          <w:lang w:val="en-US"/>
-        </w:rPr>
-        <w:t>0</w:t>
-      </w:r>
-      <w:r>
-        <w:rPr>
-          <w:sz w:val="28"/>
-          <w:szCs w:val="28"/>
-          <w:lang w:val="en-US"/>
-        </w:rPr>
-        <w:t>:</w:t>
-      </w:r>
-      <w:r>
-        <w:rPr>
-          <w:sz w:val="28"/>
-          <w:szCs w:val="28"/>
-          <w:lang w:val="en-US"/>
-        </w:rPr>
-        <w:t xml:space="preserve">3 </w:t>
-      </w:r>
-      <w:r>
-        <w:rPr>
-          <w:sz w:val="28"/>
-          <w:szCs w:val="28"/>
-          <w:lang w:val="en-US"/>
-        </w:rPr>
-        <w:t xml:space="preserve">– </w:t>
-      </w:r>
-      <w:r>
-        <w:rPr>
-          <w:sz w:val="28"/>
-          <w:szCs w:val="28"/>
-          <w:lang w:val="en-US"/>
-        </w:rPr>
-        <w:t>Address</w:t>
-      </w:r>
-    </w:p>
-    <w:p>
-      <w:pPr>
-        <w:pStyle w:val="ListParagraph"/>
-        <w:ind w:left="634"/>
-        <w:rPr>
-          <w:sz w:val="28"/>
-          <w:szCs w:val="28"/>
-          <w:lang w:val="en-US"/>
-        </w:rPr>
-      </w:pPr>
-      <w:r>
-        <w:rPr>
-          <w:sz w:val="28"/>
-          <w:szCs w:val="28"/>
-          <w:lang w:val="en-US"/>
-        </w:rPr>
-        <w:tab/>
-      </w:r>
-      <w:r>
-        <w:rPr>
-          <w:sz w:val="28"/>
-          <w:szCs w:val="28"/>
-          <w:lang w:val="en-US"/>
-        </w:rPr>
-        <w:t>2</w:t>
-      </w:r>
-      <w:r>
-        <w:rPr>
-          <w:sz w:val="28"/>
-          <w:szCs w:val="28"/>
-          <w:lang w:val="en-US"/>
-        </w:rPr>
-        <w:t>:0 - Reserved</w:t>
-      </w:r>
-    </w:p>
-    <w:p>
-      <w:pPr>
-        <w:pStyle w:val="ListParagraph"/>
-        <w:ind w:left="634"/>
-        <w:rPr>
-          <w:sz w:val="28"/>
-          <w:szCs w:val="28"/>
-          <w:lang w:val="en-US"/>
-        </w:rPr>
-      </w:pPr>
-    </w:p>
-    <w:p>
-      <w:pPr>
-        <w:pStyle w:val="ListParagraph"/>
-        <w:ind w:left="634"/>
-        <w:rPr>
-          <w:b/>
-          <w:bCs/>
-          <w:sz w:val="28"/>
-          <w:szCs w:val="28"/>
-          <w:lang w:val="en-US"/>
-        </w:rPr>
-      </w:pPr>
-      <w:r>
-        <w:rPr>
-          <w:b/>
-          <w:bCs/>
-          <w:sz w:val="28"/>
-          <w:szCs w:val="28"/>
-          <w:lang w:val="en-US"/>
-        </w:rPr>
-        <w:t>Bits Distribution [15-0] (</w:t>
-      </w:r>
-      <w:r>
-        <w:rPr>
-          <w:b/>
-          <w:bCs/>
-          <w:sz w:val="28"/>
-          <w:szCs w:val="28"/>
-          <w:lang w:val="en-US"/>
-        </w:rPr>
-        <w:t>JZ</w:t>
-      </w:r>
-      <w:r>
-        <w:rPr>
-          <w:b/>
-          <w:bCs/>
-          <w:sz w:val="28"/>
-          <w:szCs w:val="28"/>
-          <w:lang w:val="en-US"/>
-        </w:rPr>
-        <w:t>):</w:t>
-      </w:r>
-    </w:p>
-    <w:p>
-      <w:pPr>
-        <w:pStyle w:val="ListParagraph"/>
-        <w:ind w:left="634"/>
-        <w:rPr>
-          <w:sz w:val="28"/>
-          <w:szCs w:val="28"/>
-          <w:lang w:val="en-US"/>
-        </w:rPr>
-      </w:pPr>
-      <w:r>
-        <w:rPr>
-          <w:b/>
-          <w:bCs/>
-          <w:sz w:val="28"/>
-          <w:szCs w:val="28"/>
-          <w:lang w:val="en-US"/>
-        </w:rPr>
-        <w:t xml:space="preserve"> </w:t>
-      </w:r>
-      <w:r>
-        <w:rPr>
-          <w:b/>
-          <w:bCs/>
-          <w:sz w:val="28"/>
-          <w:szCs w:val="28"/>
-          <w:lang w:val="en-US"/>
-        </w:rPr>
-        <w:tab/>
-      </w:r>
-      <w:r>
-        <w:rPr>
-          <w:sz w:val="28"/>
-          <w:szCs w:val="28"/>
-          <w:lang w:val="en-US"/>
-        </w:rPr>
-        <w:t>15:12 – Operation</w:t>
-      </w:r>
-      <w:r>
-        <w:rPr>
-          <w:sz w:val="28"/>
-          <w:szCs w:val="28"/>
-          <w:lang w:val="en-US"/>
-        </w:rPr>
-        <w:br/>
-      </w:r>
-      <w:r>
-        <w:rPr>
-          <w:sz w:val="28"/>
-          <w:szCs w:val="28"/>
-          <w:lang w:val="en-US"/>
-        </w:rPr>
-        <w:tab/>
-        <w:t xml:space="preserve">11 – </w:t>
-      </w:r>
-      <w:r>
-        <w:rPr>
-          <w:sz w:val="28"/>
-          <w:szCs w:val="28"/>
-          <w:lang w:val="en-US"/>
-        </w:rPr>
-        <w:t>Flag</w:t>
-      </w:r>
-    </w:p>
-    <w:p>
-      <w:pPr>
-        <w:pStyle w:val="ListParagraph"/>
-        <w:ind w:left="634"/>
-        <w:rPr>
-          <w:sz w:val="28"/>
-          <w:szCs w:val="28"/>
-          <w:lang w:val="en-US"/>
-        </w:rPr>
-      </w:pPr>
-      <w:r>
-        <w:rPr>
-          <w:sz w:val="28"/>
-          <w:szCs w:val="28"/>
-          <w:lang w:val="en-US"/>
-        </w:rPr>
-        <w:tab/>
-        <w:t xml:space="preserve">10:3 – </w:t>
       </w:r>
       <w:r>
         <w:rPr>
@@ -3975,7 +4193,7 @@
           <w:noProof/>
         </w:rPr>
         <w:drawing>
-          <wp:inline distT="0" distB="0" distL="0" distR="0" wp14:anchorId="3EEFF4BD" wp14:editId="07AC1C1A">
+          <wp:inline distT="0" distB="0" distL="0" distR="0" wp14:anchorId="3EEFF4BD" wp14:editId="5C7763A8">
             <wp:extent cx="5940425" cy="1614170"/>
             <wp:effectExtent l="0" t="0" r="3175" b="5080"/>
             <wp:docPr id="3" name="Picture 3"/>
@@ -4842,6 +5060,7 @@
       </w:pPr>
       <w:r>
         <w:rPr>
+          <w:noProof/>
           <w:sz w:val="28"/>
           <w:szCs w:val="28"/>
           <w:lang w:val="en-US"/>

</xml_diff>